<commit_message>
Refuse harmful questions plainly, follow the new timetable portal in tests, and update the report and slides
Harmful requests (for example making a bomb) now get a short refusal that says what the
assistant can help with, without sending the student to the college website. The check
runs before any search, so it is instant. Eval cases use the new timetable address.
Report and presentation have the final test numbers and the new portal address.

Co-Authored-By: Claude Sonnet 5.5 <noreply@anthropic.com>
</commit_message>
<xml_diff>
--- a/report-build/Query_Campus_Project_Report.docx
+++ b/report-build/Query_Campus_Project_Report.docx
@@ -89,7 +89,7 @@
           <w:sz w:val="32"/>
           <w:szCs w:val="32"/>
         </w:rPr>
-        <w:t xml:space="preserve">Information Technology</w:t>
+        <w:t xml:space="preserve">Information Technology and Computer Science Engineering</w:t>
       </w:r>
     </w:p>
     <w:p>
@@ -270,7 +270,7 @@
           <w:sz w:val="32"/>
           <w:szCs w:val="32"/>
         </w:rPr>
-        <w:t xml:space="preserve">Department of Information Technology</w:t>
+        <w:t xml:space="preserve">Department of Information Technology and Computer Science Engineering</w:t>
       </w:r>
     </w:p>
     <w:p>
@@ -354,7 +354,7 @@
         <w:spacing w:after="360" w:before="240"/>
         <w:jc w:val="center"/>
       </w:pPr>
-      <w:bookmarkStart w:name="fm_cert" w:id="63"/>
+      <w:bookmarkStart w:name="fm_cert" w:id="86"/>
       <w:r>
         <w:rPr>
           <w:rFonts w:ascii="Times New Roman" w:cs="Times New Roman" w:eastAsia="Times New Roman" w:hAnsi="Times New Roman"/>
@@ -365,7 +365,7 @@
         </w:rPr>
         <w:t xml:space="preserve">CERTIFICATE</w:t>
       </w:r>
-      <w:bookmarkEnd w:id="63"/>
+      <w:bookmarkEnd w:id="86"/>
     </w:p>
     <w:p>
       <w:pPr>
@@ -378,7 +378,7 @@
           <w:sz w:val="28"/>
           <w:szCs w:val="28"/>
         </w:rPr>
-        <w:t xml:space="preserve">The project report entitled “Query Campus: A Retrieval-Augmented Generation Based Conversational Assistant For College Website Information Access” submitted by Akshat Sharma, Tanmay Choudhary, Riya Rawat is approved for partial fulfillment for the award of Bachelor of Engineering in Information Technology degree by Devi Ahilya Vishwavidyalaya, Indore.</w:t>
+        <w:t xml:space="preserve">The project report entitled “Query Campus: A Retrieval-Augmented Generation Based Conversational Assistant For College Website Information Access” submitted by Akshat Sharma, Tanmay Choudhary, Riya Rawat is approved for partial fulfillment for the award of Bachelor of Engineering in Information Technology and Computer Science Engineering degree by Devi Ahilya Vishwavidyalaya, Indore.</w:t>
       </w:r>
     </w:p>
     <w:tbl>
@@ -456,7 +456,7 @@
         <w:spacing w:after="360" w:before="0"/>
         <w:jc w:val="center"/>
       </w:pPr>
-      <w:bookmarkStart w:name="fm_rec" w:id="64"/>
+      <w:bookmarkStart w:name="fm_rec" w:id="87"/>
       <w:r>
         <w:rPr>
           <w:rFonts w:ascii="Times New Roman" w:cs="Times New Roman" w:eastAsia="Times New Roman" w:hAnsi="Times New Roman"/>
@@ -467,7 +467,7 @@
         </w:rPr>
         <w:t xml:space="preserve">Recommendation</w:t>
       </w:r>
-      <w:bookmarkEnd w:id="64"/>
+      <w:bookmarkEnd w:id="87"/>
     </w:p>
     <w:p>
       <w:pPr>
@@ -480,12 +480,12 @@
           <w:sz w:val="28"/>
           <w:szCs w:val="28"/>
         </w:rPr>
-        <w:t xml:space="preserve">The dissertation entitled “Query Campus: A Retrieval-Augmented Generation Based Conversational Assistant For College Website Information Access” submitted by Akshat Sharma, Tanmay Choudhary, Riya Rawat is a satisfactory account of the bonafide work done under my supervision and is recommended towards the partial fulfillment for the award of Bachelor of Engineering in Information Technology degree by Devi Ahilya Vishwavidyalaya, Indore.</w:t>
-      </w:r>
-    </w:p>
-    <w:p>
-      <w:pPr>
-        <w:spacing w:after="480" w:before="0"/>
+        <w:t xml:space="preserve">The dissertation entitled “Query Campus: A Retrieval-Augmented Generation Based Conversational Assistant For College Website Information Access” submitted by Akshat Sharma, Tanmay Choudhary, Riya Rawat is a satisfactory account of the bonafide work done under my supervision and is recommended towards the partial fulfillment for the award of Bachelor of Engineering in Information Technology and Computer Science Engineering degree by Devi Ahilya Vishwavidyalaya, Indore.</w:t>
+      </w:r>
+    </w:p>
+    <w:p>
+      <w:pPr>
+        <w:spacing w:after="720" w:before="0"/>
         <w:ind w:left="5200"/>
         <w:jc w:val="left"/>
       </w:pPr>
@@ -495,7 +495,7 @@
           <w:sz w:val="28"/>
           <w:szCs w:val="28"/>
         </w:rPr>
-        <w:t xml:space="preserve">(Signature of Project Guide)</w:t>
+        <w:t xml:space="preserve"/>
       </w:r>
     </w:p>
     <w:p>
@@ -531,21 +531,6 @@
     </w:p>
     <w:p>
       <w:pPr>
-        <w:spacing w:after="40" w:before="0"/>
-        <w:ind w:left="5200"/>
-        <w:jc w:val="left"/>
-      </w:pPr>
-      <w:r>
-        <w:rPr>
-          <w:rFonts w:ascii="Times New Roman" w:cs="Times New Roman" w:eastAsia="Times New Roman" w:hAnsi="Times New Roman"/>
-          <w:sz w:val="28"/>
-          <w:szCs w:val="28"/>
-        </w:rPr>
-        <w:t xml:space="preserve">[Designation of Project Guide]</w:t>
-      </w:r>
-    </w:p>
-    <w:p>
-      <w:pPr>
         <w:spacing w:after="960" w:before="0"/>
         <w:ind w:left="5200"/>
         <w:jc w:val="left"/>
@@ -559,45 +544,170 @@
         <w:t xml:space="preserve">Department of Computer Engineering</w:t>
       </w:r>
     </w:p>
-    <w:p>
-      <w:pPr>
-        <w:spacing w:after="120" w:before="0"/>
-        <w:ind w:left="5200"/>
-        <w:jc w:val="left"/>
-      </w:pPr>
-      <w:r>
-        <w:rPr>
-          <w:rFonts w:ascii="Times New Roman" w:cs="Times New Roman" w:eastAsia="Times New Roman" w:hAnsi="Times New Roman"/>
-          <w:sz w:val="28"/>
-          <w:szCs w:val="28"/>
-        </w:rPr>
-        <w:t xml:space="preserve">(Signature of HOD)</w:t>
-      </w:r>
-    </w:p>
-    <w:p>
-      <w:pPr>
-        <w:spacing w:after="120" w:before="0"/>
-        <w:ind w:left="5200"/>
-        <w:jc w:val="left"/>
-      </w:pPr>
-      <w:r>
-        <w:rPr>
-          <w:rFonts w:ascii="Times New Roman" w:cs="Times New Roman" w:eastAsia="Times New Roman" w:hAnsi="Times New Roman"/>
-          <w:b/>
-          <w:bCs/>
-          <w:sz w:val="28"/>
-          <w:szCs w:val="28"/>
-        </w:rPr>
-        <w:t xml:space="preserve">Counter signature of HOD with seal</w:t>
-      </w:r>
-    </w:p>
+    <w:tbl>
+      <w:tblPr>
+        <w:tblW w:type="dxa" w:w="9026"/>
+        <w:tblBorders>
+          <w:top w:val="single" w:color="auto" w:sz="4"/>
+          <w:left w:val="single" w:color="auto" w:sz="4"/>
+          <w:bottom w:val="single" w:color="auto" w:sz="4"/>
+          <w:right w:val="single" w:color="auto" w:sz="4"/>
+          <w:insideH w:val="single" w:color="auto" w:sz="4"/>
+          <w:insideV w:val="single" w:color="auto" w:sz="4"/>
+        </w:tblBorders>
+      </w:tblPr>
+      <w:tblGrid>
+        <w:gridCol w:w="4513"/>
+        <w:gridCol w:w="4513"/>
+      </w:tblGrid>
+      <w:tr>
+        <w:tc>
+          <w:tcPr>
+            <w:tcW w:type="dxa" w:w="4513"/>
+            <w:tcBorders>
+              <w:top w:val="none" w:color="FFFFFF" w:sz="0"/>
+              <w:left w:val="none" w:color="FFFFFF" w:sz="0"/>
+              <w:bottom w:val="none" w:color="FFFFFF" w:sz="0"/>
+              <w:right w:val="none" w:color="FFFFFF" w:sz="0"/>
+            </w:tcBorders>
+          </w:tcPr>
+          <w:p>
+            <w:pPr>
+              <w:spacing w:after="720" w:before="0"/>
+              <w:jc w:val="left"/>
+            </w:pPr>
+            <w:r>
+              <w:rPr>
+                <w:rFonts w:ascii="Times New Roman" w:cs="Times New Roman" w:eastAsia="Times New Roman" w:hAnsi="Times New Roman"/>
+                <w:sz w:val="28"/>
+                <w:szCs w:val="28"/>
+              </w:rPr>
+              <w:t xml:space="preserve"/>
+            </w:r>
+          </w:p>
+          <w:p>
+            <w:pPr>
+              <w:spacing w:after="120" w:before="0"/>
+              <w:jc w:val="left"/>
+            </w:pPr>
+            <w:r>
+              <w:rPr>
+                <w:rFonts w:ascii="Times New Roman" w:cs="Times New Roman" w:eastAsia="Times New Roman" w:hAnsi="Times New Roman"/>
+                <w:b/>
+                <w:bCs/>
+                <w:sz w:val="28"/>
+                <w:szCs w:val="28"/>
+              </w:rPr>
+              <w:t xml:space="preserve">Counter signature of HOD with seal</w:t>
+            </w:r>
+          </w:p>
+          <w:p>
+            <w:pPr>
+              <w:spacing w:after="20" w:before="0"/>
+              <w:jc w:val="left"/>
+            </w:pPr>
+            <w:r>
+              <w:rPr>
+                <w:rFonts w:ascii="Times New Roman" w:cs="Times New Roman" w:eastAsia="Times New Roman" w:hAnsi="Times New Roman"/>
+                <w:sz w:val="28"/>
+                <w:szCs w:val="28"/>
+              </w:rPr>
+              <w:t xml:space="preserve">Head of the Department</w:t>
+            </w:r>
+          </w:p>
+          <w:p>
+            <w:pPr>
+              <w:spacing w:after="20" w:before="0"/>
+              <w:jc w:val="left"/>
+            </w:pPr>
+            <w:r>
+              <w:rPr>
+                <w:rFonts w:ascii="Times New Roman" w:cs="Times New Roman" w:eastAsia="Times New Roman" w:hAnsi="Times New Roman"/>
+                <w:sz w:val="28"/>
+                <w:szCs w:val="28"/>
+              </w:rPr>
+              <w:t xml:space="preserve">Department of Information Technology</w:t>
+            </w:r>
+          </w:p>
+        </w:tc>
+        <w:tc>
+          <w:tcPr>
+            <w:tcW w:type="dxa" w:w="4513"/>
+            <w:tcBorders>
+              <w:top w:val="none" w:color="FFFFFF" w:sz="0"/>
+              <w:left w:val="none" w:color="FFFFFF" w:sz="0"/>
+              <w:bottom w:val="none" w:color="FFFFFF" w:sz="0"/>
+              <w:right w:val="none" w:color="FFFFFF" w:sz="0"/>
+            </w:tcBorders>
+          </w:tcPr>
+          <w:p>
+            <w:pPr>
+              <w:spacing w:after="720" w:before="0"/>
+              <w:jc w:val="left"/>
+            </w:pPr>
+            <w:r>
+              <w:rPr>
+                <w:rFonts w:ascii="Times New Roman" w:cs="Times New Roman" w:eastAsia="Times New Roman" w:hAnsi="Times New Roman"/>
+                <w:sz w:val="28"/>
+                <w:szCs w:val="28"/>
+              </w:rPr>
+              <w:t xml:space="preserve"/>
+            </w:r>
+          </w:p>
+          <w:p>
+            <w:pPr>
+              <w:spacing w:after="120" w:before="0"/>
+              <w:jc w:val="left"/>
+            </w:pPr>
+            <w:r>
+              <w:rPr>
+                <w:rFonts w:ascii="Times New Roman" w:cs="Times New Roman" w:eastAsia="Times New Roman" w:hAnsi="Times New Roman"/>
+                <w:b/>
+                <w:bCs/>
+                <w:sz w:val="28"/>
+                <w:szCs w:val="28"/>
+              </w:rPr>
+              <w:t xml:space="preserve">Counter signature of HOD with seal</w:t>
+            </w:r>
+          </w:p>
+          <w:p>
+            <w:pPr>
+              <w:spacing w:after="20" w:before="0"/>
+              <w:jc w:val="left"/>
+            </w:pPr>
+            <w:r>
+              <w:rPr>
+                <w:rFonts w:ascii="Times New Roman" w:cs="Times New Roman" w:eastAsia="Times New Roman" w:hAnsi="Times New Roman"/>
+                <w:sz w:val="28"/>
+                <w:szCs w:val="28"/>
+              </w:rPr>
+              <w:t xml:space="preserve">Head of the Department</w:t>
+            </w:r>
+          </w:p>
+          <w:p>
+            <w:pPr>
+              <w:spacing w:after="20" w:before="0"/>
+              <w:jc w:val="left"/>
+            </w:pPr>
+            <w:r>
+              <w:rPr>
+                <w:rFonts w:ascii="Times New Roman" w:cs="Times New Roman" w:eastAsia="Times New Roman" w:hAnsi="Times New Roman"/>
+                <w:sz w:val="28"/>
+                <w:szCs w:val="28"/>
+              </w:rPr>
+              <w:t xml:space="preserve">Department of Computer Science Engineering</w:t>
+            </w:r>
+          </w:p>
+        </w:tc>
+      </w:tr>
+    </w:tbl>
     <w:p>
       <w:pPr>
         <w:pageBreakBefore/>
         <w:spacing w:after="360" w:before="0"/>
         <w:jc w:val="center"/>
       </w:pPr>
-      <w:bookmarkStart w:name="fm_decl" w:id="65"/>
+      <w:bookmarkStart w:name="fm_decl" w:id="88"/>
       <w:r>
         <w:rPr>
           <w:rFonts w:ascii="Times New Roman" w:cs="Times New Roman" w:eastAsia="Times New Roman" w:hAnsi="Times New Roman"/>
@@ -608,7 +718,7 @@
         </w:rPr>
         <w:t xml:space="preserve">Candidate Declaration</w:t>
       </w:r>
-      <w:bookmarkEnd w:id="65"/>
+      <w:bookmarkEnd w:id="88"/>
     </w:p>
     <w:p>
       <w:pPr>
@@ -621,7 +731,7 @@
           <w:sz w:val="28"/>
           <w:szCs w:val="28"/>
         </w:rPr>
-        <w:t xml:space="preserve">We hereby declare that the work which is being presented in this project entitled “Query Campus: A Retrieval-Augmented Generation Based Conversational Assistant For College Website Information Access” in partial fulfillment of degree of Bachelor of Engineering in Information Technology is an authentic record of our own work carried out under the supervision and guidance of Vedpriya Dongre, [Designation of Project Guide] in Department of Computer Engineering, Institute of Engineering and Technology, Devi Ahilya Vishwavidyalaya, Indore.</w:t>
+        <w:t xml:space="preserve">We hereby declare that the work which is being presented in this project entitled “Query Campus: A Retrieval-Augmented Generation Based Conversational Assistant For College Website Information Access” in partial fulfillment of degree of Bachelor of Engineering in Information Technology and Computer Science Engineering is an authentic record of our own work carried out under the supervision and guidance of Vedpriya Dongre, Department of Computer Engineering, Institute of Engineering and Technology, Devi Ahilya Vishwavidyalaya, Indore.</w:t>
       </w:r>
     </w:p>
     <w:p>
@@ -664,6 +774,21 @@
           <w:szCs w:val="28"/>
         </w:rPr>
         <w:t xml:space="preserve">Place: Indore</w:t>
+      </w:r>
+    </w:p>
+    <w:p>
+      <w:pPr>
+        <w:spacing w:after="360" w:before="0"/>
+        <w:ind w:left="5200"/>
+        <w:jc w:val="left"/>
+      </w:pPr>
+      <w:r>
+        <w:rPr>
+          <w:rFonts w:ascii="Times New Roman" w:cs="Times New Roman" w:eastAsia="Times New Roman" w:hAnsi="Times New Roman"/>
+          <w:sz w:val="28"/>
+          <w:szCs w:val="28"/>
+        </w:rPr>
+        <w:t xml:space="preserve"/>
       </w:r>
     </w:p>
     <w:p>
@@ -678,7 +803,37 @@
           <w:sz w:val="28"/>
           <w:szCs w:val="28"/>
         </w:rPr>
-        <w:t xml:space="preserve">(Signature of student 1)</w:t>
+        <w:t xml:space="preserve">Akshat Sharma</w:t>
+      </w:r>
+    </w:p>
+    <w:p>
+      <w:pPr>
+        <w:spacing w:after="60" w:before="0"/>
+        <w:ind w:left="5200"/>
+        <w:jc w:val="left"/>
+      </w:pPr>
+      <w:r>
+        <w:rPr>
+          <w:rFonts w:ascii="Times New Roman" w:cs="Times New Roman" w:eastAsia="Times New Roman" w:hAnsi="Times New Roman"/>
+          <w:sz w:val="28"/>
+          <w:szCs w:val="28"/>
+        </w:rPr>
+        <w:t xml:space="preserve">23BIT005</w:t>
+      </w:r>
+    </w:p>
+    <w:p>
+      <w:pPr>
+        <w:spacing w:after="360" w:before="120"/>
+        <w:ind w:left="5200"/>
+        <w:jc w:val="left"/>
+      </w:pPr>
+      <w:r>
+        <w:rPr>
+          <w:rFonts w:ascii="Times New Roman" w:cs="Times New Roman" w:eastAsia="Times New Roman" w:hAnsi="Times New Roman"/>
+          <w:sz w:val="28"/>
+          <w:szCs w:val="28"/>
+        </w:rPr>
+        <w:t xml:space="preserve"/>
       </w:r>
     </w:p>
     <w:p>
@@ -693,7 +848,7 @@
           <w:sz w:val="28"/>
           <w:szCs w:val="28"/>
         </w:rPr>
-        <w:t xml:space="preserve">Akshat Sharma</w:t>
+        <w:t xml:space="preserve">Tanmay Choudhary</w:t>
       </w:r>
     </w:p>
     <w:p>
@@ -708,12 +863,12 @@
           <w:sz w:val="28"/>
           <w:szCs w:val="28"/>
         </w:rPr>
-        <w:t xml:space="preserve">23BIT005</w:t>
-      </w:r>
-    </w:p>
-    <w:p>
-      <w:pPr>
-        <w:spacing w:after="20" w:before="240"/>
+        <w:t xml:space="preserve">23BCS072</w:t>
+      </w:r>
+    </w:p>
+    <w:p>
+      <w:pPr>
+        <w:spacing w:after="360" w:before="120"/>
         <w:ind w:left="5200"/>
         <w:jc w:val="left"/>
       </w:pPr>
@@ -723,7 +878,7 @@
           <w:sz w:val="28"/>
           <w:szCs w:val="28"/>
         </w:rPr>
-        <w:t xml:space="preserve">(Signature of student 2)</w:t>
+        <w:t xml:space="preserve"/>
       </w:r>
     </w:p>
     <w:p>
@@ -738,7 +893,7 @@
           <w:sz w:val="28"/>
           <w:szCs w:val="28"/>
         </w:rPr>
-        <w:t xml:space="preserve">Tanmay Choudhary</w:t>
+        <w:t xml:space="preserve">Riya Rawat</w:t>
       </w:r>
     </w:p>
     <w:p>
@@ -753,51 +908,6 @@
           <w:sz w:val="28"/>
           <w:szCs w:val="28"/>
         </w:rPr>
-        <w:t xml:space="preserve">23BCS072</w:t>
-      </w:r>
-    </w:p>
-    <w:p>
-      <w:pPr>
-        <w:spacing w:after="20" w:before="240"/>
-        <w:ind w:left="5200"/>
-        <w:jc w:val="left"/>
-      </w:pPr>
-      <w:r>
-        <w:rPr>
-          <w:rFonts w:ascii="Times New Roman" w:cs="Times New Roman" w:eastAsia="Times New Roman" w:hAnsi="Times New Roman"/>
-          <w:sz w:val="28"/>
-          <w:szCs w:val="28"/>
-        </w:rPr>
-        <w:t xml:space="preserve">(Signature of student 3)</w:t>
-      </w:r>
-    </w:p>
-    <w:p>
-      <w:pPr>
-        <w:spacing w:after="20" w:before="0"/>
-        <w:ind w:left="5200"/>
-        <w:jc w:val="left"/>
-      </w:pPr>
-      <w:r>
-        <w:rPr>
-          <w:rFonts w:ascii="Times New Roman" w:cs="Times New Roman" w:eastAsia="Times New Roman" w:hAnsi="Times New Roman"/>
-          <w:sz w:val="28"/>
-          <w:szCs w:val="28"/>
-        </w:rPr>
-        <w:t xml:space="preserve">Riya Rawat</w:t>
-      </w:r>
-    </w:p>
-    <w:p>
-      <w:pPr>
-        <w:spacing w:after="60" w:before="0"/>
-        <w:ind w:left="5200"/>
-        <w:jc w:val="left"/>
-      </w:pPr>
-      <w:r>
-        <w:rPr>
-          <w:rFonts w:ascii="Times New Roman" w:cs="Times New Roman" w:eastAsia="Times New Roman" w:hAnsi="Times New Roman"/>
-          <w:sz w:val="28"/>
-          <w:szCs w:val="28"/>
-        </w:rPr>
         <w:t xml:space="preserve">23BIT060</w:t>
       </w:r>
     </w:p>
@@ -807,7 +917,7 @@
         <w:spacing w:after="360" w:before="0"/>
         <w:jc w:val="center"/>
       </w:pPr>
-      <w:bookmarkStart w:name="fm_plag" w:id="66"/>
+      <w:bookmarkStart w:name="fm_plag" w:id="89"/>
       <w:r>
         <w:rPr>
           <w:rFonts w:ascii="Times New Roman" w:cs="Times New Roman" w:eastAsia="Times New Roman" w:hAnsi="Times New Roman"/>
@@ -818,7 +928,7 @@
         </w:rPr>
         <w:t xml:space="preserve">SELF-DECLARATION OF PLAGIARISM REPORT</w:t>
       </w:r>
-      <w:bookmarkEnd w:id="66"/>
+      <w:bookmarkEnd w:id="89"/>
     </w:p>
     <w:p>
       <w:pPr>
@@ -831,7 +941,7 @@
           <w:sz w:val="28"/>
           <w:szCs w:val="28"/>
         </w:rPr>
-        <w:t xml:space="preserve">The project report entitled “Query Campus: A Retrieval-Augmented Generation Based Conversational Assistant For College Website Information Access” submitted by Akshat Sharma, Tanmay Choudhary, Riya Rawat in partial fulfillment of the requirement for the award of the degree of B.E. in Information Technology has been checked for plagiarism using a standard plagiarism detection tool.</w:t>
+        <w:t xml:space="preserve">The project report entitled “Query Campus: A Retrieval-Augmented Generation Based Conversational Assistant For College Website Information Access” submitted by Akshat Sharma, Tanmay Choudhary, Riya Rawat in partial fulfillment of the requirement for the award of the degree of B.E. in Information Technology and Computer Science Engineering has been checked for plagiarism using a standard plagiarism detection tool.</w:t>
       </w:r>
     </w:p>
     <w:p>
@@ -995,7 +1105,7 @@
         <w:spacing w:after="360" w:before="0"/>
         <w:jc w:val="center"/>
       </w:pPr>
-      <w:bookmarkStart w:name="fm_ack" w:id="67"/>
+      <w:bookmarkStart w:name="fm_ack" w:id="90"/>
       <w:r>
         <w:rPr>
           <w:rFonts w:ascii="Times New Roman" w:cs="Times New Roman" w:eastAsia="Times New Roman" w:hAnsi="Times New Roman"/>
@@ -1006,7 +1116,7 @@
         </w:rPr>
         <w:t xml:space="preserve">ACKNOWLEDGEMENTS</w:t>
       </w:r>
-      <w:bookmarkEnd w:id="67"/>
+      <w:bookmarkEnd w:id="90"/>
     </w:p>
     <w:p>
       <w:pPr>
@@ -1033,7 +1143,7 @@
           <w:sz w:val="28"/>
           <w:szCs w:val="28"/>
         </w:rPr>
-        <w:t xml:space="preserve">We thank [Name of HOD], Head of the Department, for the departmental facilities and for allowing us to carry out this work.</w:t>
+        <w:t xml:space="preserve">We thank Dr. Hemant Makwana, Head of the Department of Information Technology, and Dr. Ashish Kumar Jain, Head of the Department of Computer Science Engineering, for the departmental facilities and for allowing us to carry out this work.</w:t>
       </w:r>
     </w:p>
     <w:p>
@@ -1047,7 +1157,7 @@
           <w:sz w:val="28"/>
           <w:szCs w:val="28"/>
         </w:rPr>
-        <w:t xml:space="preserve">We thank [Name of Director], Director, Institute of Engineering &amp; Technology, Devi Ahilya Vishwavidyalaya, Indore, for the computers and internet that we needed to collect, index and test the data. The public information on the institute’s website and timetable website is the knowledge base of this project.</w:t>
+        <w:t xml:space="preserve">We thank Dr. Pratosh Bansal, Director, Institute of Engineering &amp; Technology, Devi Ahilya Vishwavidyalaya, Indore, for the computers and internet that we needed to collect, index and test the data. The public information on the institute’s website and timetable website is the knowledge base of this project.</w:t>
       </w:r>
     </w:p>
     <w:p>
@@ -1070,7 +1180,7 @@
         <w:spacing w:after="360" w:before="0"/>
         <w:jc w:val="center"/>
       </w:pPr>
-      <w:bookmarkStart w:name="fm_abs" w:id="68"/>
+      <w:bookmarkStart w:name="fm_abs" w:id="91"/>
       <w:r>
         <w:rPr>
           <w:rFonts w:ascii="Times New Roman" w:cs="Times New Roman" w:eastAsia="Times New Roman" w:hAnsi="Times New Roman"/>
@@ -1081,7 +1191,7 @@
         </w:rPr>
         <w:t xml:space="preserve">ABSTRACT</w:t>
       </w:r>
-      <w:bookmarkEnd w:id="68"/>
+      <w:bookmarkEnd w:id="91"/>
     </w:p>
     <w:p>
       <w:pPr>
@@ -1122,7 +1232,7 @@
           <w:sz w:val="28"/>
           <w:szCs w:val="28"/>
         </w:rPr>
-        <w:t xml:space="preserve">On a test set of 18 real questions, the assistant answered all correctly, usually in 1.5 to 4 seconds, and it said it could not find the answer when the answer was not there. The project shows that a small, low-cost system can give a college a reliable question-answering service.</w:t>
+        <w:t xml:space="preserve">On a test set of 19 real questions, the assistant answered all correctly, usually in 1.5 to 4 seconds, and it said it could not find the answer when the answer was not there. The project shows that a small, low-cost system can give a college a reliable question-answering service.</w:t>
       </w:r>
     </w:p>
     <w:p>
@@ -1984,6 +2094,861 @@
           <w:szCs w:val="28"/>
         </w:rPr>
         <w:t xml:space="preserve">42</w:t>
+      </w:r>
+    </w:p>
+    <w:p>
+      <w:pPr>
+        <w:tabs>
+          <w:tab w:val="right" w:pos="9000" w:leader="dot"/>
+        </w:tabs>
+        <w:spacing w:after="60" w:line="300"/>
+        <w:ind w:left="0"/>
+      </w:pPr>
+      <w:r>
+        <w:rPr>
+          <w:rFonts w:ascii="Times New Roman" w:cs="Times New Roman" w:eastAsia="Times New Roman" w:hAnsi="Times New Roman"/>
+          <w:b/>
+          <w:bCs/>
+          <w:sz w:val="28"/>
+          <w:szCs w:val="28"/>
+        </w:rPr>
+        <w:t xml:space="preserve">Appendix</w:t>
+      </w:r>
+      <w:r>
+        <w:rPr>
+          <w:rFonts w:ascii="Times New Roman" w:cs="Times New Roman" w:eastAsia="Times New Roman" w:hAnsi="Times New Roman"/>
+          <w:sz w:val="28"/>
+          <w:szCs w:val="28"/>
+        </w:rPr>
+        <w:t xml:space="preserve">	</w:t>
+      </w:r>
+      <w:r>
+        <w:rPr>
+          <w:rFonts w:ascii="Times New Roman" w:cs="Times New Roman" w:eastAsia="Times New Roman" w:hAnsi="Times New Roman"/>
+          <w:b/>
+          <w:bCs/>
+          <w:sz w:val="28"/>
+          <w:szCs w:val="28"/>
+        </w:rPr>
+        <w:t xml:space="preserve">44</w:t>
+      </w:r>
+    </w:p>
+    <w:p>
+      <w:pPr>
+        <w:keepNext/>
+        <w:spacing w:after="200" w:before="480"/>
+        <w:jc w:val="center"/>
+      </w:pPr>
+      <w:r>
+        <w:rPr>
+          <w:rFonts w:ascii="Times New Roman" w:cs="Times New Roman" w:eastAsia="Times New Roman" w:hAnsi="Times New Roman"/>
+          <w:b/>
+          <w:bCs/>
+          <w:sz w:val="32"/>
+          <w:szCs w:val="32"/>
+        </w:rPr>
+        <w:t xml:space="preserve">LIST OF TABLES</w:t>
+      </w:r>
+    </w:p>
+    <w:p>
+      <w:pPr>
+        <w:keepNext/>
+        <w:tabs>
+          <w:tab w:val="right" w:pos="9000"/>
+        </w:tabs>
+        <w:spacing w:after="100"/>
+      </w:pPr>
+      <w:r>
+        <w:rPr>
+          <w:rFonts w:ascii="Times New Roman" w:cs="Times New Roman" w:eastAsia="Times New Roman" w:hAnsi="Times New Roman"/>
+          <w:b/>
+          <w:bCs/>
+          <w:sz w:val="28"/>
+          <w:szCs w:val="28"/>
+        </w:rPr>
+        <w:t xml:space="preserve">TABLE</w:t>
+      </w:r>
+      <w:r>
+        <w:rPr>
+          <w:rFonts w:ascii="Times New Roman" w:cs="Times New Roman" w:eastAsia="Times New Roman" w:hAnsi="Times New Roman"/>
+          <w:b/>
+          <w:bCs/>
+          <w:sz w:val="28"/>
+          <w:szCs w:val="28"/>
+        </w:rPr>
+        <w:t xml:space="preserve">	Page No</w:t>
+      </w:r>
+    </w:p>
+    <w:p>
+      <w:pPr>
+        <w:tabs>
+          <w:tab w:val="right" w:pos="9000" w:leader="dot"/>
+        </w:tabs>
+        <w:spacing w:after="60" w:line="300"/>
+        <w:ind w:left="0"/>
+      </w:pPr>
+      <w:r>
+        <w:rPr>
+          <w:rFonts w:ascii="Times New Roman" w:cs="Times New Roman" w:eastAsia="Times New Roman" w:hAnsi="Times New Roman"/>
+          <w:sz w:val="28"/>
+          <w:szCs w:val="28"/>
+        </w:rPr>
+        <w:t xml:space="preserve">Table 2.1: Comparison of existing solutions with Query Campus</w:t>
+      </w:r>
+      <w:r>
+        <w:rPr>
+          <w:rFonts w:ascii="Times New Roman" w:cs="Times New Roman" w:eastAsia="Times New Roman" w:hAnsi="Times New Roman"/>
+          <w:sz w:val="28"/>
+          <w:szCs w:val="28"/>
+        </w:rPr>
+        <w:t xml:space="preserve">	</w:t>
+      </w:r>
+      <w:r>
+        <w:rPr>
+          <w:rFonts w:ascii="Times New Roman" w:cs="Times New Roman" w:eastAsia="Times New Roman" w:hAnsi="Times New Roman"/>
+          <w:sz w:val="28"/>
+          <w:szCs w:val="28"/>
+        </w:rPr>
+        <w:t xml:space="preserve">5</w:t>
+      </w:r>
+    </w:p>
+    <w:p>
+      <w:pPr>
+        <w:tabs>
+          <w:tab w:val="right" w:pos="9000" w:leader="dot"/>
+        </w:tabs>
+        <w:spacing w:after="60" w:line="300"/>
+        <w:ind w:left="0"/>
+      </w:pPr>
+      <w:r>
+        <w:rPr>
+          <w:rFonts w:ascii="Times New Roman" w:cs="Times New Roman" w:eastAsia="Times New Roman" w:hAnsi="Times New Roman"/>
+          <w:sz w:val="28"/>
+          <w:szCs w:val="28"/>
+        </w:rPr>
+        <w:t xml:space="preserve">Table 3.1: Software requirements</w:t>
+      </w:r>
+      <w:r>
+        <w:rPr>
+          <w:rFonts w:ascii="Times New Roman" w:cs="Times New Roman" w:eastAsia="Times New Roman" w:hAnsi="Times New Roman"/>
+          <w:sz w:val="28"/>
+          <w:szCs w:val="28"/>
+        </w:rPr>
+        <w:t xml:space="preserve">	</w:t>
+      </w:r>
+      <w:r>
+        <w:rPr>
+          <w:rFonts w:ascii="Times New Roman" w:cs="Times New Roman" w:eastAsia="Times New Roman" w:hAnsi="Times New Roman"/>
+          <w:sz w:val="28"/>
+          <w:szCs w:val="28"/>
+        </w:rPr>
+        <w:t xml:space="preserve">8</w:t>
+      </w:r>
+    </w:p>
+    <w:p>
+      <w:pPr>
+        <w:tabs>
+          <w:tab w:val="right" w:pos="9000" w:leader="dot"/>
+        </w:tabs>
+        <w:spacing w:after="60" w:line="300"/>
+        <w:ind w:left="0"/>
+      </w:pPr>
+      <w:r>
+        <w:rPr>
+          <w:rFonts w:ascii="Times New Roman" w:cs="Times New Roman" w:eastAsia="Times New Roman" w:hAnsi="Times New Roman"/>
+          <w:sz w:val="28"/>
+          <w:szCs w:val="28"/>
+        </w:rPr>
+        <w:t xml:space="preserve">Table 3.2: Hardware requirements</w:t>
+      </w:r>
+      <w:r>
+        <w:rPr>
+          <w:rFonts w:ascii="Times New Roman" w:cs="Times New Roman" w:eastAsia="Times New Roman" w:hAnsi="Times New Roman"/>
+          <w:sz w:val="28"/>
+          <w:szCs w:val="28"/>
+        </w:rPr>
+        <w:t xml:space="preserve">	</w:t>
+      </w:r>
+      <w:r>
+        <w:rPr>
+          <w:rFonts w:ascii="Times New Roman" w:cs="Times New Roman" w:eastAsia="Times New Roman" w:hAnsi="Times New Roman"/>
+          <w:sz w:val="28"/>
+          <w:szCs w:val="28"/>
+        </w:rPr>
+        <w:t xml:space="preserve">9</w:t>
+      </w:r>
+    </w:p>
+    <w:p>
+      <w:pPr>
+        <w:tabs>
+          <w:tab w:val="right" w:pos="9000" w:leader="dot"/>
+        </w:tabs>
+        <w:spacing w:after="60" w:line="300"/>
+        <w:ind w:left="0"/>
+      </w:pPr>
+      <w:r>
+        <w:rPr>
+          <w:rFonts w:ascii="Times New Roman" w:cs="Times New Roman" w:eastAsia="Times New Roman" w:hAnsi="Times New Roman"/>
+          <w:sz w:val="28"/>
+          <w:szCs w:val="28"/>
+        </w:rPr>
+        <w:t xml:space="preserve">Table 4.1: ScrapedDocument (scraped.json and timetables.json)</w:t>
+      </w:r>
+      <w:r>
+        <w:rPr>
+          <w:rFonts w:ascii="Times New Roman" w:cs="Times New Roman" w:eastAsia="Times New Roman" w:hAnsi="Times New Roman"/>
+          <w:sz w:val="28"/>
+          <w:szCs w:val="28"/>
+        </w:rPr>
+        <w:t xml:space="preserve">	</w:t>
+      </w:r>
+      <w:r>
+        <w:rPr>
+          <w:rFonts w:ascii="Times New Roman" w:cs="Times New Roman" w:eastAsia="Times New Roman" w:hAnsi="Times New Roman"/>
+          <w:sz w:val="28"/>
+          <w:szCs w:val="28"/>
+        </w:rPr>
+        <w:t xml:space="preserve">23</w:t>
+      </w:r>
+    </w:p>
+    <w:p>
+      <w:pPr>
+        <w:tabs>
+          <w:tab w:val="right" w:pos="9000" w:leader="dot"/>
+        </w:tabs>
+        <w:spacing w:after="60" w:line="300"/>
+        <w:ind w:left="0"/>
+      </w:pPr>
+      <w:r>
+        <w:rPr>
+          <w:rFonts w:ascii="Times New Roman" w:cs="Times New Roman" w:eastAsia="Times New Roman" w:hAnsi="Times New Roman"/>
+          <w:sz w:val="28"/>
+          <w:szCs w:val="28"/>
+        </w:rPr>
+        <w:t xml:space="preserve">Table 4.2: Chunk (Pinecone index “query-campus”)</w:t>
+      </w:r>
+      <w:r>
+        <w:rPr>
+          <w:rFonts w:ascii="Times New Roman" w:cs="Times New Roman" w:eastAsia="Times New Roman" w:hAnsi="Times New Roman"/>
+          <w:sz w:val="28"/>
+          <w:szCs w:val="28"/>
+        </w:rPr>
+        <w:t xml:space="preserve">	</w:t>
+      </w:r>
+      <w:r>
+        <w:rPr>
+          <w:rFonts w:ascii="Times New Roman" w:cs="Times New Roman" w:eastAsia="Times New Roman" w:hAnsi="Times New Roman"/>
+          <w:sz w:val="28"/>
+          <w:szCs w:val="28"/>
+        </w:rPr>
+        <w:t xml:space="preserve">24</w:t>
+      </w:r>
+    </w:p>
+    <w:p>
+      <w:pPr>
+        <w:tabs>
+          <w:tab w:val="right" w:pos="9000" w:leader="dot"/>
+        </w:tabs>
+        <w:spacing w:after="60" w:line="300"/>
+        <w:ind w:left="0"/>
+      </w:pPr>
+      <w:r>
+        <w:rPr>
+          <w:rFonts w:ascii="Times New Roman" w:cs="Times New Roman" w:eastAsia="Times New Roman" w:hAnsi="Times New Roman"/>
+          <w:sz w:val="28"/>
+          <w:szCs w:val="28"/>
+        </w:rPr>
+        <w:t xml:space="preserve">Table 4.3: KeywordCacheEntry (keyword-chunks.json)</w:t>
+      </w:r>
+      <w:r>
+        <w:rPr>
+          <w:rFonts w:ascii="Times New Roman" w:cs="Times New Roman" w:eastAsia="Times New Roman" w:hAnsi="Times New Roman"/>
+          <w:sz w:val="28"/>
+          <w:szCs w:val="28"/>
+        </w:rPr>
+        <w:t xml:space="preserve">	</w:t>
+      </w:r>
+      <w:r>
+        <w:rPr>
+          <w:rFonts w:ascii="Times New Roman" w:cs="Times New Roman" w:eastAsia="Times New Roman" w:hAnsi="Times New Roman"/>
+          <w:sz w:val="28"/>
+          <w:szCs w:val="28"/>
+        </w:rPr>
+        <w:t xml:space="preserve">24</w:t>
+      </w:r>
+    </w:p>
+    <w:p>
+      <w:pPr>
+        <w:tabs>
+          <w:tab w:val="right" w:pos="9000" w:leader="dot"/>
+        </w:tabs>
+        <w:spacing w:after="60" w:line="300"/>
+        <w:ind w:left="0"/>
+      </w:pPr>
+      <w:r>
+        <w:rPr>
+          <w:rFonts w:ascii="Times New Roman" w:cs="Times New Roman" w:eastAsia="Times New Roman" w:hAnsi="Times New Roman"/>
+          <w:sz w:val="28"/>
+          <w:szCs w:val="28"/>
+        </w:rPr>
+        <w:t xml:space="preserve">Table 4.4: Chat (browser localStorage)</w:t>
+      </w:r>
+      <w:r>
+        <w:rPr>
+          <w:rFonts w:ascii="Times New Roman" w:cs="Times New Roman" w:eastAsia="Times New Roman" w:hAnsi="Times New Roman"/>
+          <w:sz w:val="28"/>
+          <w:szCs w:val="28"/>
+        </w:rPr>
+        <w:t xml:space="preserve">	</w:t>
+      </w:r>
+      <w:r>
+        <w:rPr>
+          <w:rFonts w:ascii="Times New Roman" w:cs="Times New Roman" w:eastAsia="Times New Roman" w:hAnsi="Times New Roman"/>
+          <w:sz w:val="28"/>
+          <w:szCs w:val="28"/>
+        </w:rPr>
+        <w:t xml:space="preserve">25</w:t>
+      </w:r>
+    </w:p>
+    <w:p>
+      <w:pPr>
+        <w:tabs>
+          <w:tab w:val="right" w:pos="9000" w:leader="dot"/>
+        </w:tabs>
+        <w:spacing w:after="60" w:line="300"/>
+        <w:ind w:left="0"/>
+      </w:pPr>
+      <w:r>
+        <w:rPr>
+          <w:rFonts w:ascii="Times New Roman" w:cs="Times New Roman" w:eastAsia="Times New Roman" w:hAnsi="Times New Roman"/>
+          <w:sz w:val="28"/>
+          <w:szCs w:val="28"/>
+        </w:rPr>
+        <w:t xml:space="preserve">Table 4.5: Message (stored inside a Chat)</w:t>
+      </w:r>
+      <w:r>
+        <w:rPr>
+          <w:rFonts w:ascii="Times New Roman" w:cs="Times New Roman" w:eastAsia="Times New Roman" w:hAnsi="Times New Roman"/>
+          <w:sz w:val="28"/>
+          <w:szCs w:val="28"/>
+        </w:rPr>
+        <w:t xml:space="preserve">	</w:t>
+      </w:r>
+      <w:r>
+        <w:rPr>
+          <w:rFonts w:ascii="Times New Roman" w:cs="Times New Roman" w:eastAsia="Times New Roman" w:hAnsi="Times New Roman"/>
+          <w:sz w:val="28"/>
+          <w:szCs w:val="28"/>
+        </w:rPr>
+        <w:t xml:space="preserve">25</w:t>
+      </w:r>
+    </w:p>
+    <w:p>
+      <w:pPr>
+        <w:tabs>
+          <w:tab w:val="right" w:pos="9000" w:leader="dot"/>
+        </w:tabs>
+        <w:spacing w:after="60" w:line="300"/>
+        <w:ind w:left="0"/>
+      </w:pPr>
+      <w:r>
+        <w:rPr>
+          <w:rFonts w:ascii="Times New Roman" w:cs="Times New Roman" w:eastAsia="Times New Roman" w:hAnsi="Times New Roman"/>
+          <w:sz w:val="28"/>
+          <w:szCs w:val="28"/>
+        </w:rPr>
+        <w:t xml:space="preserve">Table 4.6: EvalCase (eval/cases.json)</w:t>
+      </w:r>
+      <w:r>
+        <w:rPr>
+          <w:rFonts w:ascii="Times New Roman" w:cs="Times New Roman" w:eastAsia="Times New Roman" w:hAnsi="Times New Roman"/>
+          <w:sz w:val="28"/>
+          <w:szCs w:val="28"/>
+        </w:rPr>
+        <w:t xml:space="preserve">	</w:t>
+      </w:r>
+      <w:r>
+        <w:rPr>
+          <w:rFonts w:ascii="Times New Roman" w:cs="Times New Roman" w:eastAsia="Times New Roman" w:hAnsi="Times New Roman"/>
+          <w:sz w:val="28"/>
+          <w:szCs w:val="28"/>
+        </w:rPr>
+        <w:t xml:space="preserve">25</w:t>
+      </w:r>
+    </w:p>
+    <w:p>
+      <w:pPr>
+        <w:tabs>
+          <w:tab w:val="right" w:pos="9000" w:leader="dot"/>
+        </w:tabs>
+        <w:spacing w:after="60" w:line="300"/>
+        <w:ind w:left="0"/>
+      </w:pPr>
+      <w:r>
+        <w:rPr>
+          <w:rFonts w:ascii="Times New Roman" w:cs="Times New Roman" w:eastAsia="Times New Roman" w:hAnsi="Times New Roman"/>
+          <w:sz w:val="28"/>
+          <w:szCs w:val="28"/>
+        </w:rPr>
+        <w:t xml:space="preserve">Table 4.7: Accuracy test of 19 questions (23 October 2026)</w:t>
+      </w:r>
+      <w:r>
+        <w:rPr>
+          <w:rFonts w:ascii="Times New Roman" w:cs="Times New Roman" w:eastAsia="Times New Roman" w:hAnsi="Times New Roman"/>
+          <w:sz w:val="28"/>
+          <w:szCs w:val="28"/>
+        </w:rPr>
+        <w:t xml:space="preserve">	</w:t>
+      </w:r>
+      <w:r>
+        <w:rPr>
+          <w:rFonts w:ascii="Times New Roman" w:cs="Times New Roman" w:eastAsia="Times New Roman" w:hAnsi="Times New Roman"/>
+          <w:sz w:val="28"/>
+          <w:szCs w:val="28"/>
+        </w:rPr>
+        <w:t xml:space="preserve">37</w:t>
+      </w:r>
+    </w:p>
+    <w:p>
+      <w:pPr>
+        <w:tabs>
+          <w:tab w:val="right" w:pos="9000" w:leader="dot"/>
+        </w:tabs>
+        <w:spacing w:after="60" w:line="300"/>
+        <w:ind w:left="0"/>
+      </w:pPr>
+      <w:r>
+        <w:rPr>
+          <w:rFonts w:ascii="Times New Roman" w:cs="Times New Roman" w:eastAsia="Times New Roman" w:hAnsi="Times New Roman"/>
+          <w:sz w:val="28"/>
+          <w:szCs w:val="28"/>
+        </w:rPr>
+        <w:t xml:space="preserve">Table 5.1: Key results</w:t>
+      </w:r>
+      <w:r>
+        <w:rPr>
+          <w:rFonts w:ascii="Times New Roman" w:cs="Times New Roman" w:eastAsia="Times New Roman" w:hAnsi="Times New Roman"/>
+          <w:sz w:val="28"/>
+          <w:szCs w:val="28"/>
+        </w:rPr>
+        <w:t xml:space="preserve">	</w:t>
+      </w:r>
+      <w:r>
+        <w:rPr>
+          <w:rFonts w:ascii="Times New Roman" w:cs="Times New Roman" w:eastAsia="Times New Roman" w:hAnsi="Times New Roman"/>
+          <w:sz w:val="28"/>
+          <w:szCs w:val="28"/>
+        </w:rPr>
+        <w:t xml:space="preserve">39</w:t>
+      </w:r>
+    </w:p>
+    <w:p>
+      <w:pPr>
+        <w:keepNext/>
+        <w:spacing w:after="200" w:before="480"/>
+        <w:jc w:val="center"/>
+      </w:pPr>
+      <w:r>
+        <w:rPr>
+          <w:rFonts w:ascii="Times New Roman" w:cs="Times New Roman" w:eastAsia="Times New Roman" w:hAnsi="Times New Roman"/>
+          <w:b/>
+          <w:bCs/>
+          <w:sz w:val="32"/>
+          <w:szCs w:val="32"/>
+        </w:rPr>
+        <w:t xml:space="preserve">LIST OF FIGURES</w:t>
+      </w:r>
+    </w:p>
+    <w:p>
+      <w:pPr>
+        <w:keepNext/>
+        <w:tabs>
+          <w:tab w:val="right" w:pos="9000"/>
+        </w:tabs>
+        <w:spacing w:after="100"/>
+      </w:pPr>
+      <w:r>
+        <w:rPr>
+          <w:rFonts w:ascii="Times New Roman" w:cs="Times New Roman" w:eastAsia="Times New Roman" w:hAnsi="Times New Roman"/>
+          <w:b/>
+          <w:bCs/>
+          <w:sz w:val="28"/>
+          <w:szCs w:val="28"/>
+        </w:rPr>
+        <w:t xml:space="preserve">FIGURE</w:t>
+      </w:r>
+      <w:r>
+        <w:rPr>
+          <w:rFonts w:ascii="Times New Roman" w:cs="Times New Roman" w:eastAsia="Times New Roman" w:hAnsi="Times New Roman"/>
+          <w:b/>
+          <w:bCs/>
+          <w:sz w:val="28"/>
+          <w:szCs w:val="28"/>
+        </w:rPr>
+        <w:t xml:space="preserve">	Page No</w:t>
+      </w:r>
+    </w:p>
+    <w:p>
+      <w:pPr>
+        <w:tabs>
+          <w:tab w:val="right" w:pos="9000" w:leader="dot"/>
+        </w:tabs>
+        <w:spacing w:after="60" w:line="300"/>
+        <w:ind w:left="0"/>
+      </w:pPr>
+      <w:r>
+        <w:rPr>
+          <w:rFonts w:ascii="Times New Roman" w:cs="Times New Roman" w:eastAsia="Times New Roman" w:hAnsi="Times New Roman"/>
+          <w:sz w:val="28"/>
+          <w:szCs w:val="28"/>
+        </w:rPr>
+        <w:t xml:space="preserve">Fig. 1.1: Flow diagrams (indexing and answering)</w:t>
+      </w:r>
+      <w:r>
+        <w:rPr>
+          <w:rFonts w:ascii="Times New Roman" w:cs="Times New Roman" w:eastAsia="Times New Roman" w:hAnsi="Times New Roman"/>
+          <w:sz w:val="28"/>
+          <w:szCs w:val="28"/>
+        </w:rPr>
+        <w:t xml:space="preserve">	</w:t>
+      </w:r>
+      <w:r>
+        <w:rPr>
+          <w:rFonts w:ascii="Times New Roman" w:cs="Times New Roman" w:eastAsia="Times New Roman" w:hAnsi="Times New Roman"/>
+          <w:sz w:val="28"/>
+          <w:szCs w:val="28"/>
+        </w:rPr>
+        <w:t xml:space="preserve">3</w:t>
+      </w:r>
+    </w:p>
+    <w:p>
+      <w:pPr>
+        <w:tabs>
+          <w:tab w:val="right" w:pos="9000" w:leader="dot"/>
+        </w:tabs>
+        <w:spacing w:after="60" w:line="300"/>
+        <w:ind w:left="0"/>
+      </w:pPr>
+      <w:r>
+        <w:rPr>
+          <w:rFonts w:ascii="Times New Roman" w:cs="Times New Roman" w:eastAsia="Times New Roman" w:hAnsi="Times New Roman"/>
+          <w:sz w:val="28"/>
+          <w:szCs w:val="28"/>
+        </w:rPr>
+        <w:t xml:space="preserve">Fig. 3.1: Use case model of Query Campus</w:t>
+      </w:r>
+      <w:r>
+        <w:rPr>
+          <w:rFonts w:ascii="Times New Roman" w:cs="Times New Roman" w:eastAsia="Times New Roman" w:hAnsi="Times New Roman"/>
+          <w:sz w:val="28"/>
+          <w:szCs w:val="28"/>
+        </w:rPr>
+        <w:t xml:space="preserve">	</w:t>
+      </w:r>
+      <w:r>
+        <w:rPr>
+          <w:rFonts w:ascii="Times New Roman" w:cs="Times New Roman" w:eastAsia="Times New Roman" w:hAnsi="Times New Roman"/>
+          <w:sz w:val="28"/>
+          <w:szCs w:val="28"/>
+        </w:rPr>
+        <w:t xml:space="preserve">10</w:t>
+      </w:r>
+    </w:p>
+    <w:p>
+      <w:pPr>
+        <w:tabs>
+          <w:tab w:val="right" w:pos="9000" w:leader="dot"/>
+        </w:tabs>
+        <w:spacing w:after="60" w:line="300"/>
+        <w:ind w:left="0"/>
+      </w:pPr>
+      <w:r>
+        <w:rPr>
+          <w:rFonts w:ascii="Times New Roman" w:cs="Times New Roman" w:eastAsia="Times New Roman" w:hAnsi="Times New Roman"/>
+          <w:sz w:val="28"/>
+          <w:szCs w:val="28"/>
+        </w:rPr>
+        <w:t xml:space="preserve">Fig. 3.2: Architecture (block) diagram of Query Campus</w:t>
+      </w:r>
+      <w:r>
+        <w:rPr>
+          <w:rFonts w:ascii="Times New Roman" w:cs="Times New Roman" w:eastAsia="Times New Roman" w:hAnsi="Times New Roman"/>
+          <w:sz w:val="28"/>
+          <w:szCs w:val="28"/>
+        </w:rPr>
+        <w:t xml:space="preserve">	</w:t>
+      </w:r>
+      <w:r>
+        <w:rPr>
+          <w:rFonts w:ascii="Times New Roman" w:cs="Times New Roman" w:eastAsia="Times New Roman" w:hAnsi="Times New Roman"/>
+          <w:sz w:val="28"/>
+          <w:szCs w:val="28"/>
+        </w:rPr>
+        <w:t xml:space="preserve">19</w:t>
+      </w:r>
+    </w:p>
+    <w:p>
+      <w:pPr>
+        <w:tabs>
+          <w:tab w:val="right" w:pos="9000" w:leader="dot"/>
+        </w:tabs>
+        <w:spacing w:after="60" w:line="300"/>
+        <w:ind w:left="0"/>
+      </w:pPr>
+      <w:r>
+        <w:rPr>
+          <w:rFonts w:ascii="Times New Roman" w:cs="Times New Roman" w:eastAsia="Times New Roman" w:hAnsi="Times New Roman"/>
+          <w:sz w:val="28"/>
+          <w:szCs w:val="28"/>
+        </w:rPr>
+        <w:t xml:space="preserve">Fig. 3.3: Sequence diagram for asking a question</w:t>
+      </w:r>
+      <w:r>
+        <w:rPr>
+          <w:rFonts w:ascii="Times New Roman" w:cs="Times New Roman" w:eastAsia="Times New Roman" w:hAnsi="Times New Roman"/>
+          <w:sz w:val="28"/>
+          <w:szCs w:val="28"/>
+        </w:rPr>
+        <w:t xml:space="preserve">	</w:t>
+      </w:r>
+      <w:r>
+        <w:rPr>
+          <w:rFonts w:ascii="Times New Roman" w:cs="Times New Roman" w:eastAsia="Times New Roman" w:hAnsi="Times New Roman"/>
+          <w:sz w:val="28"/>
+          <w:szCs w:val="28"/>
+        </w:rPr>
+        <w:t xml:space="preserve">20</w:t>
+      </w:r>
+    </w:p>
+    <w:p>
+      <w:pPr>
+        <w:tabs>
+          <w:tab w:val="right" w:pos="9000" w:leader="dot"/>
+        </w:tabs>
+        <w:spacing w:after="60" w:line="300"/>
+        <w:ind w:left="0"/>
+      </w:pPr>
+      <w:r>
+        <w:rPr>
+          <w:rFonts w:ascii="Times New Roman" w:cs="Times New Roman" w:eastAsia="Times New Roman" w:hAnsi="Times New Roman"/>
+          <w:sz w:val="28"/>
+          <w:szCs w:val="28"/>
+        </w:rPr>
+        <w:t xml:space="preserve">Fig. 3.4: Sequence diagram for scraping and indexing</w:t>
+      </w:r>
+      <w:r>
+        <w:rPr>
+          <w:rFonts w:ascii="Times New Roman" w:cs="Times New Roman" w:eastAsia="Times New Roman" w:hAnsi="Times New Roman"/>
+          <w:sz w:val="28"/>
+          <w:szCs w:val="28"/>
+        </w:rPr>
+        <w:t xml:space="preserve">	</w:t>
+      </w:r>
+      <w:r>
+        <w:rPr>
+          <w:rFonts w:ascii="Times New Roman" w:cs="Times New Roman" w:eastAsia="Times New Roman" w:hAnsi="Times New Roman"/>
+          <w:sz w:val="28"/>
+          <w:szCs w:val="28"/>
+        </w:rPr>
+        <w:t xml:space="preserve">21</w:t>
+      </w:r>
+    </w:p>
+    <w:p>
+      <w:pPr>
+        <w:tabs>
+          <w:tab w:val="right" w:pos="9000" w:leader="dot"/>
+        </w:tabs>
+        <w:spacing w:after="60" w:line="300"/>
+        <w:ind w:left="0"/>
+      </w:pPr>
+      <w:r>
+        <w:rPr>
+          <w:rFonts w:ascii="Times New Roman" w:cs="Times New Roman" w:eastAsia="Times New Roman" w:hAnsi="Times New Roman"/>
+          <w:sz w:val="28"/>
+          <w:szCs w:val="28"/>
+        </w:rPr>
+        <w:t xml:space="preserve">Fig. 4.1: Entity-relationship diagram of Query Campus</w:t>
+      </w:r>
+      <w:r>
+        <w:rPr>
+          <w:rFonts w:ascii="Times New Roman" w:cs="Times New Roman" w:eastAsia="Times New Roman" w:hAnsi="Times New Roman"/>
+          <w:sz w:val="28"/>
+          <w:szCs w:val="28"/>
+        </w:rPr>
+        <w:t xml:space="preserve">	</w:t>
+      </w:r>
+      <w:r>
+        <w:rPr>
+          <w:rFonts w:ascii="Times New Roman" w:cs="Times New Roman" w:eastAsia="Times New Roman" w:hAnsi="Times New Roman"/>
+          <w:sz w:val="28"/>
+          <w:szCs w:val="28"/>
+        </w:rPr>
+        <w:t xml:space="preserve">23</w:t>
+      </w:r>
+    </w:p>
+    <w:p>
+      <w:pPr>
+        <w:tabs>
+          <w:tab w:val="right" w:pos="9000" w:leader="dot"/>
+        </w:tabs>
+        <w:spacing w:after="60" w:line="300"/>
+        <w:ind w:left="0"/>
+      </w:pPr>
+      <w:r>
+        <w:rPr>
+          <w:rFonts w:ascii="Times New Roman" w:cs="Times New Roman" w:eastAsia="Times New Roman" w:hAnsi="Times New Roman"/>
+          <w:sz w:val="28"/>
+          <w:szCs w:val="28"/>
+        </w:rPr>
+        <w:t xml:space="preserve">Fig. 4.2: Class diagram (1 of 2): query service classes</w:t>
+      </w:r>
+      <w:r>
+        <w:rPr>
+          <w:rFonts w:ascii="Times New Roman" w:cs="Times New Roman" w:eastAsia="Times New Roman" w:hAnsi="Times New Roman"/>
+          <w:sz w:val="28"/>
+          <w:szCs w:val="28"/>
+        </w:rPr>
+        <w:t xml:space="preserve">	</w:t>
+      </w:r>
+      <w:r>
+        <w:rPr>
+          <w:rFonts w:ascii="Times New Roman" w:cs="Times New Roman" w:eastAsia="Times New Roman" w:hAnsi="Times New Roman"/>
+          <w:sz w:val="28"/>
+          <w:szCs w:val="28"/>
+        </w:rPr>
+        <w:t xml:space="preserve">26</w:t>
+      </w:r>
+    </w:p>
+    <w:p>
+      <w:pPr>
+        <w:tabs>
+          <w:tab w:val="right" w:pos="9000" w:leader="dot"/>
+        </w:tabs>
+        <w:spacing w:after="60" w:line="300"/>
+        <w:ind w:left="0"/>
+      </w:pPr>
+      <w:r>
+        <w:rPr>
+          <w:rFonts w:ascii="Times New Roman" w:cs="Times New Roman" w:eastAsia="Times New Roman" w:hAnsi="Times New Roman"/>
+          <w:sz w:val="28"/>
+          <w:szCs w:val="28"/>
+        </w:rPr>
+        <w:t xml:space="preserve">Fig. 4.3: Class diagram (2 of 2): indexing classes and data types</w:t>
+      </w:r>
+      <w:r>
+        <w:rPr>
+          <w:rFonts w:ascii="Times New Roman" w:cs="Times New Roman" w:eastAsia="Times New Roman" w:hAnsi="Times New Roman"/>
+          <w:sz w:val="28"/>
+          <w:szCs w:val="28"/>
+        </w:rPr>
+        <w:t xml:space="preserve">	</w:t>
+      </w:r>
+      <w:r>
+        <w:rPr>
+          <w:rFonts w:ascii="Times New Roman" w:cs="Times New Roman" w:eastAsia="Times New Roman" w:hAnsi="Times New Roman"/>
+          <w:sz w:val="28"/>
+          <w:szCs w:val="28"/>
+        </w:rPr>
+        <w:t xml:space="preserve">26</w:t>
+      </w:r>
+    </w:p>
+    <w:p>
+      <w:pPr>
+        <w:tabs>
+          <w:tab w:val="right" w:pos="9000" w:leader="dot"/>
+        </w:tabs>
+        <w:spacing w:after="60" w:line="300"/>
+        <w:ind w:left="0"/>
+      </w:pPr>
+      <w:r>
+        <w:rPr>
+          <w:rFonts w:ascii="Times New Roman" w:cs="Times New Roman" w:eastAsia="Times New Roman" w:hAnsi="Times New Roman"/>
+          <w:sz w:val="28"/>
+          <w:szCs w:val="28"/>
+        </w:rPr>
+        <w:t xml:space="preserve">Fig. 4.4: Home screen of Query Campus</w:t>
+      </w:r>
+      <w:r>
+        <w:rPr>
+          <w:rFonts w:ascii="Times New Roman" w:cs="Times New Roman" w:eastAsia="Times New Roman" w:hAnsi="Times New Roman"/>
+          <w:sz w:val="28"/>
+          <w:szCs w:val="28"/>
+        </w:rPr>
+        <w:t xml:space="preserve">	</w:t>
+      </w:r>
+      <w:r>
+        <w:rPr>
+          <w:rFonts w:ascii="Times New Roman" w:cs="Times New Roman" w:eastAsia="Times New Roman" w:hAnsi="Times New Roman"/>
+          <w:sz w:val="28"/>
+          <w:szCs w:val="28"/>
+        </w:rPr>
+        <w:t xml:space="preserve">32</w:t>
+      </w:r>
+    </w:p>
+    <w:p>
+      <w:pPr>
+        <w:tabs>
+          <w:tab w:val="right" w:pos="9000" w:leader="dot"/>
+        </w:tabs>
+        <w:spacing w:after="60" w:line="300"/>
+        <w:ind w:left="0"/>
+      </w:pPr>
+      <w:r>
+        <w:rPr>
+          <w:rFonts w:ascii="Times New Roman" w:cs="Times New Roman" w:eastAsia="Times New Roman" w:hAnsi="Times New Roman"/>
+          <w:sz w:val="28"/>
+          <w:szCs w:val="28"/>
+        </w:rPr>
+        <w:t xml:space="preserve">Fig. 4.5: Answer with a source link</w:t>
+      </w:r>
+      <w:r>
+        <w:rPr>
+          <w:rFonts w:ascii="Times New Roman" w:cs="Times New Roman" w:eastAsia="Times New Roman" w:hAnsi="Times New Roman"/>
+          <w:sz w:val="28"/>
+          <w:szCs w:val="28"/>
+        </w:rPr>
+        <w:t xml:space="preserve">	</w:t>
+      </w:r>
+      <w:r>
+        <w:rPr>
+          <w:rFonts w:ascii="Times New Roman" w:cs="Times New Roman" w:eastAsia="Times New Roman" w:hAnsi="Times New Roman"/>
+          <w:sz w:val="28"/>
+          <w:szCs w:val="28"/>
+        </w:rPr>
+        <w:t xml:space="preserve">33</w:t>
+      </w:r>
+    </w:p>
+    <w:p>
+      <w:pPr>
+        <w:tabs>
+          <w:tab w:val="right" w:pos="9000" w:leader="dot"/>
+        </w:tabs>
+        <w:spacing w:after="60" w:line="300"/>
+        <w:ind w:left="0"/>
+      </w:pPr>
+      <w:r>
+        <w:rPr>
+          <w:rFonts w:ascii="Times New Roman" w:cs="Times New Roman" w:eastAsia="Times New Roman" w:hAnsi="Times New Roman"/>
+          <w:sz w:val="28"/>
+          <w:szCs w:val="28"/>
+        </w:rPr>
+        <w:t xml:space="preserve">Fig. 4.6: Answer with a document card</w:t>
+      </w:r>
+      <w:r>
+        <w:rPr>
+          <w:rFonts w:ascii="Times New Roman" w:cs="Times New Roman" w:eastAsia="Times New Roman" w:hAnsi="Times New Roman"/>
+          <w:sz w:val="28"/>
+          <w:szCs w:val="28"/>
+        </w:rPr>
+        <w:t xml:space="preserve">	</w:t>
+      </w:r>
+      <w:r>
+        <w:rPr>
+          <w:rFonts w:ascii="Times New Roman" w:cs="Times New Roman" w:eastAsia="Times New Roman" w:hAnsi="Times New Roman"/>
+          <w:sz w:val="28"/>
+          <w:szCs w:val="28"/>
+        </w:rPr>
+        <w:t xml:space="preserve">34</w:t>
       </w:r>
     </w:p>
     <w:p>
@@ -2005,12 +2970,10 @@
       <w:r>
         <w:rPr>
           <w:rFonts w:ascii="Times New Roman" w:cs="Times New Roman" w:eastAsia="Times New Roman" w:hAnsi="Times New Roman"/>
-          <w:b/>
-          <w:bCs/>
           <w:sz w:val="28"/>
           <w:szCs w:val="28"/>
         </w:rPr>
-        <w:t xml:space="preserve">Appendix</w:t>
+        <w:t xml:space="preserve">Fig. 4.7: Reply when the information is not available</w:t>
       </w:r>
       <w:r>
         <w:rPr>
@@ -2023,12 +2986,10 @@
       <w:r>
         <w:rPr>
           <w:rFonts w:ascii="Times New Roman" w:cs="Times New Roman" w:eastAsia="Times New Roman" w:hAnsi="Times New Roman"/>
-          <w:b/>
-          <w:bCs/>
           <w:sz w:val="28"/>
           <w:szCs w:val="28"/>
         </w:rPr>
-        <w:t xml:space="preserve">44</w:t>
+        <w:t xml:space="preserve">35</w:t>
       </w:r>
     </w:p>
     <w:p>
@@ -2511,7 +3472,7 @@
                 <wp:inline distT="0" distB="0" distL="0" distR="0">
                   <wp:extent cx="1990725" cy="5210175"/>
                   <wp:effectExtent t="0" r="0" b="0" l="0"/>
-                  <wp:docPr id="1" name="Fig. 1.1: Flow diagrams of Query Campus (left: indexing, right: answering)" descr="Fig. 1.1: Flow diagrams of Query Campus (left: indexing, right: answering)" title="Fig. 1.1: Flow diagrams of Query Campus (left: indexing, right: answering)"/>
+                  <wp:docPr id="1" name="Fig. 1.1: Flow diagrams (indexing and answering)" descr="Fig. 1.1: Flow diagrams (indexing and answering)" title="Fig. 1.1: Flow diagrams (indexing and answering)"/>
                   <wp:cNvGraphicFramePr>
                     <a:graphicFrameLocks xmlns:a="http://schemas.openxmlformats.org/drawingml/2006/main" noChangeAspect="1"/>
                   </wp:cNvGraphicFramePr>
@@ -2567,7 +3528,7 @@
                 <wp:inline distT="0" distB="0" distL="0" distR="0">
                   <wp:extent cx="2609850" cy="5210175"/>
                   <wp:effectExtent t="0" r="0" b="0" l="0"/>
-                  <wp:docPr id="2" name="Fig. 1.1: Flow diagrams of Query Campus (left: indexing, right: answering)" descr="Fig. 1.1: Flow diagrams of Query Campus (left: indexing, right: answering)" title="Fig. 1.1: Flow diagrams of Query Campus (left: indexing, right: answering)"/>
+                  <wp:docPr id="2" name="Fig. 1.1: Flow diagrams (indexing and answering)" descr="Fig. 1.1: Flow diagrams (indexing and answering)" title="Fig. 1.1: Flow diagrams (indexing and answering)"/>
                   <wp:cNvGraphicFramePr>
                     <a:graphicFrameLocks xmlns:a="http://schemas.openxmlformats.org/drawingml/2006/main" noChangeAspect="1"/>
                   </wp:cNvGraphicFramePr>
@@ -2611,6 +3572,7 @@
         <w:spacing w:after="240" w:before="80" w:line="360"/>
         <w:jc w:val="center"/>
       </w:pPr>
+      <w:bookmarkStart w:name="cap_fig_1_1" w:id="5"/>
       <w:r>
         <w:rPr>
           <w:rFonts w:ascii="Times New Roman" w:cs="Times New Roman" w:eastAsia="Times New Roman" w:hAnsi="Times New Roman"/>
@@ -2619,8 +3581,9 @@
           <w:sz w:val="24"/>
           <w:szCs w:val="24"/>
         </w:rPr>
-        <w:t xml:space="preserve">Fig. 1.1: Flow diagrams of Query Campus (left: indexing, right: answering)</w:t>
-      </w:r>
+        <w:t xml:space="preserve">Fig. 1.1: Flow diagrams (indexing and answering)</w:t>
+      </w:r>
+      <w:bookmarkEnd w:id="5"/>
     </w:p>
     <w:p>
       <w:pPr>
@@ -2768,7 +3731,7 @@
           <w:sz w:val="24"/>
           <w:szCs w:val="24"/>
         </w:rPr>
-        <w:t xml:space="preserve">Has a test tool with 18 questions to check the accuracy.</w:t>
+        <w:t xml:space="preserve">Has a test tool with 19 questions to check the accuracy.</w:t>
       </w:r>
     </w:p>
     <w:p>
@@ -2803,7 +3766,7 @@
         <w:spacing w:after="360" w:before="0" w:line="360"/>
         <w:jc w:val="left"/>
       </w:pPr>
-      <w:bookmarkStart w:name="ch2" w:id="5"/>
+      <w:bookmarkStart w:name="ch2" w:id="6"/>
       <w:r>
         <w:rPr>
           <w:rFonts w:ascii="Times New Roman" w:cs="Times New Roman" w:eastAsia="Times New Roman" w:hAnsi="Times New Roman"/>
@@ -2814,7 +3777,7 @@
         </w:rPr>
         <w:t xml:space="preserve">Chapter-2 Literature Survey</w:t>
       </w:r>
-      <w:bookmarkEnd w:id="5"/>
+      <w:bookmarkEnd w:id="6"/>
     </w:p>
     <w:p>
       <w:pPr>
@@ -2823,7 +3786,7 @@
         <w:spacing w:after="360" w:before="120" w:line="360"/>
         <w:jc w:val="left"/>
       </w:pPr>
-      <w:bookmarkStart w:name="c2_1" w:id="6"/>
+      <w:bookmarkStart w:name="c2_1" w:id="7"/>
       <w:r>
         <w:rPr>
           <w:rFonts w:ascii="Times New Roman" w:cs="Times New Roman" w:eastAsia="Times New Roman" w:hAnsi="Times New Roman"/>
@@ -2834,7 +3797,7 @@
         </w:rPr>
         <w:t xml:space="preserve">2.1 Existing Solutions</w:t>
       </w:r>
-      <w:bookmarkEnd w:id="6"/>
+      <w:bookmarkEnd w:id="7"/>
     </w:p>
     <w:p>
       <w:pPr>
@@ -2997,9 +3960,10 @@
     <w:p>
       <w:pPr>
         <w:keepNext/>
-        <w:spacing w:after="80" w:before="0" w:line="360"/>
+        <w:spacing w:after="80" w:line="360"/>
         <w:jc w:val="center"/>
       </w:pPr>
+      <w:bookmarkStart w:name="cap_tbl_2_1" w:id="8"/>
       <w:r>
         <w:rPr>
           <w:rFonts w:ascii="Times New Roman" w:cs="Times New Roman" w:eastAsia="Times New Roman" w:hAnsi="Times New Roman"/>
@@ -3010,6 +3974,7 @@
         </w:rPr>
         <w:t xml:space="preserve">Table 2.1: Comparison of existing solutions with Query Campus</w:t>
       </w:r>
+      <w:bookmarkEnd w:id="8"/>
     </w:p>
     <w:tbl>
       <w:tblPr>
@@ -4194,7 +5159,7 @@
         <w:spacing w:after="360" w:before="120" w:line="360"/>
         <w:jc w:val="left"/>
       </w:pPr>
-      <w:bookmarkStart w:name="c2_2" w:id="7"/>
+      <w:bookmarkStart w:name="c2_2" w:id="9"/>
       <w:r>
         <w:rPr>
           <w:rFonts w:ascii="Times New Roman" w:cs="Times New Roman" w:eastAsia="Times New Roman" w:hAnsi="Times New Roman"/>
@@ -4205,7 +5170,7 @@
         </w:rPr>
         <w:t xml:space="preserve">2.2 Methodology</w:t>
       </w:r>
-      <w:bookmarkEnd w:id="7"/>
+      <w:bookmarkEnd w:id="9"/>
     </w:p>
     <w:p>
       <w:pPr>
@@ -4214,7 +5179,7 @@
         <w:spacing w:after="360" w:before="120" w:line="360"/>
         <w:jc w:val="left"/>
       </w:pPr>
-      <w:bookmarkStart w:name="h_1" w:id="8"/>
+      <w:bookmarkStart w:name="h_1" w:id="10"/>
       <w:r>
         <w:rPr>
           <w:rFonts w:ascii="Times New Roman" w:cs="Times New Roman" w:eastAsia="Times New Roman" w:hAnsi="Times New Roman"/>
@@ -4225,7 +5190,7 @@
         </w:rPr>
         <w:t xml:space="preserve">2.2.1 Steps followed</w:t>
       </w:r>
-      <w:bookmarkEnd w:id="8"/>
+      <w:bookmarkEnd w:id="10"/>
     </w:p>
     <w:p>
       <w:pPr>
@@ -4398,7 +5363,7 @@
           <w:sz w:val="24"/>
           <w:szCs w:val="24"/>
         </w:rPr>
-        <w:t xml:space="preserve"> We tested with 18 real questions and fixed the problems we found.</w:t>
+        <w:t xml:space="preserve"> We tested with 19 real questions and fixed the problems we found.</w:t>
       </w:r>
     </w:p>
     <w:p>
@@ -4408,7 +5373,7 @@
         <w:spacing w:after="360" w:before="120" w:line="360"/>
         <w:jc w:val="left"/>
       </w:pPr>
-      <w:bookmarkStart w:name="h_2" w:id="9"/>
+      <w:bookmarkStart w:name="h_2" w:id="11"/>
       <w:r>
         <w:rPr>
           <w:rFonts w:ascii="Times New Roman" w:cs="Times New Roman" w:eastAsia="Times New Roman" w:hAnsi="Times New Roman"/>
@@ -4419,7 +5384,7 @@
         </w:rPr>
         <w:t xml:space="preserve">2.2.2 Concepts needed to understand the project</w:t>
       </w:r>
-      <w:bookmarkEnd w:id="9"/>
+      <w:bookmarkEnd w:id="11"/>
     </w:p>
     <w:p>
       <w:pPr>
@@ -4645,7 +5610,7 @@
         <w:spacing w:after="360" w:before="0" w:line="360"/>
         <w:jc w:val="left"/>
       </w:pPr>
-      <w:bookmarkStart w:name="ch3" w:id="10"/>
+      <w:bookmarkStart w:name="ch3" w:id="12"/>
       <w:r>
         <w:rPr>
           <w:rFonts w:ascii="Times New Roman" w:cs="Times New Roman" w:eastAsia="Times New Roman" w:hAnsi="Times New Roman"/>
@@ -4656,7 +5621,7 @@
         </w:rPr>
         <w:t xml:space="preserve">Chapter-3 Analysis &amp; Design</w:t>
       </w:r>
-      <w:bookmarkEnd w:id="10"/>
+      <w:bookmarkEnd w:id="12"/>
     </w:p>
     <w:p>
       <w:pPr>
@@ -4665,7 +5630,7 @@
         <w:spacing w:after="360" w:before="120" w:line="360"/>
         <w:jc w:val="left"/>
       </w:pPr>
-      <w:bookmarkStart w:name="c3_1" w:id="11"/>
+      <w:bookmarkStart w:name="c3_1" w:id="13"/>
       <w:r>
         <w:rPr>
           <w:rFonts w:ascii="Times New Roman" w:cs="Times New Roman" w:eastAsia="Times New Roman" w:hAnsi="Times New Roman"/>
@@ -4676,7 +5641,7 @@
         </w:rPr>
         <w:t xml:space="preserve">3.1 Software Requirements</w:t>
       </w:r>
-      <w:bookmarkEnd w:id="11"/>
+      <w:bookmarkEnd w:id="13"/>
     </w:p>
     <w:p>
       <w:pPr>
@@ -4695,9 +5660,10 @@
     <w:p>
       <w:pPr>
         <w:keepNext/>
-        <w:spacing w:after="80" w:before="0" w:line="360"/>
+        <w:spacing w:after="80" w:line="360"/>
         <w:jc w:val="center"/>
       </w:pPr>
+      <w:bookmarkStart w:name="cap_tbl_3_1" w:id="14"/>
       <w:r>
         <w:rPr>
           <w:rFonts w:ascii="Times New Roman" w:cs="Times New Roman" w:eastAsia="Times New Roman" w:hAnsi="Times New Roman"/>
@@ -4708,6 +5674,7 @@
         </w:rPr>
         <w:t xml:space="preserve">Table 3.1: Software requirements</w:t>
       </w:r>
+      <w:bookmarkEnd w:id="14"/>
     </w:p>
     <w:tbl>
       <w:tblPr>
@@ -5837,7 +6804,7 @@
         <w:spacing w:after="360" w:before="120" w:line="360"/>
         <w:jc w:val="left"/>
       </w:pPr>
-      <w:bookmarkStart w:name="c3_2" w:id="12"/>
+      <w:bookmarkStart w:name="c3_2" w:id="15"/>
       <w:r>
         <w:rPr>
           <w:rFonts w:ascii="Times New Roman" w:cs="Times New Roman" w:eastAsia="Times New Roman" w:hAnsi="Times New Roman"/>
@@ -5848,7 +6815,7 @@
         </w:rPr>
         <w:t xml:space="preserve">3.2 Hardware Requirements</w:t>
       </w:r>
-      <w:bookmarkEnd w:id="12"/>
+      <w:bookmarkEnd w:id="15"/>
     </w:p>
     <w:p>
       <w:pPr>
@@ -5867,9 +6834,10 @@
     <w:p>
       <w:pPr>
         <w:keepNext/>
-        <w:spacing w:after="80" w:before="0" w:line="360"/>
+        <w:spacing w:after="80" w:line="360"/>
         <w:jc w:val="center"/>
       </w:pPr>
+      <w:bookmarkStart w:name="cap_tbl_3_2" w:id="16"/>
       <w:r>
         <w:rPr>
           <w:rFonts w:ascii="Times New Roman" w:cs="Times New Roman" w:eastAsia="Times New Roman" w:hAnsi="Times New Roman"/>
@@ -5880,6 +6848,7 @@
         </w:rPr>
         <w:t xml:space="preserve">Table 3.2: Hardware requirements</w:t>
       </w:r>
+      <w:bookmarkEnd w:id="16"/>
     </w:p>
     <w:tbl>
       <w:tblPr>
@@ -6664,7 +7633,7 @@
         <w:spacing w:after="360" w:before="120" w:line="360"/>
         <w:jc w:val="left"/>
       </w:pPr>
-      <w:bookmarkStart w:name="c3_3" w:id="13"/>
+      <w:bookmarkStart w:name="c3_3" w:id="17"/>
       <w:r>
         <w:rPr>
           <w:rFonts w:ascii="Times New Roman" w:cs="Times New Roman" w:eastAsia="Times New Roman" w:hAnsi="Times New Roman"/>
@@ -6675,7 +7644,7 @@
         </w:rPr>
         <w:t xml:space="preserve">3.3 Analysis Diagrams</w:t>
       </w:r>
-      <w:bookmarkEnd w:id="13"/>
+      <w:bookmarkEnd w:id="17"/>
     </w:p>
     <w:p>
       <w:pPr>
@@ -6684,7 +7653,7 @@
         <w:spacing w:after="360" w:before="120" w:line="360"/>
         <w:jc w:val="left"/>
       </w:pPr>
-      <w:bookmarkStart w:name="h_3" w:id="14"/>
+      <w:bookmarkStart w:name="h_3" w:id="18"/>
       <w:r>
         <w:rPr>
           <w:rFonts w:ascii="Times New Roman" w:cs="Times New Roman" w:eastAsia="Times New Roman" w:hAnsi="Times New Roman"/>
@@ -6695,7 +7664,7 @@
         </w:rPr>
         <w:t xml:space="preserve">3.3.1 Use Case Model</w:t>
       </w:r>
-      <w:bookmarkEnd w:id="14"/>
+      <w:bookmarkEnd w:id="18"/>
     </w:p>
     <w:p>
       <w:pPr>
@@ -6799,6 +7768,7 @@
         <w:spacing w:after="240" w:before="80" w:line="360"/>
         <w:jc w:val="center"/>
       </w:pPr>
+      <w:bookmarkStart w:name="cap_fig_3_1" w:id="19"/>
       <w:r>
         <w:rPr>
           <w:rFonts w:ascii="Times New Roman" w:cs="Times New Roman" w:eastAsia="Times New Roman" w:hAnsi="Times New Roman"/>
@@ -6809,6 +7779,7 @@
         </w:rPr>
         <w:t xml:space="preserve">Fig. 3.1: Use case model of Query Campus</w:t>
       </w:r>
+      <w:bookmarkEnd w:id="19"/>
     </w:p>
     <w:p>
       <w:pPr>
@@ -6817,7 +7788,7 @@
         <w:spacing w:after="360" w:before="120" w:line="360"/>
         <w:jc w:val="left"/>
       </w:pPr>
-      <w:bookmarkStart w:name="h_4" w:id="15"/>
+      <w:bookmarkStart w:name="h_4" w:id="20"/>
       <w:r>
         <w:rPr>
           <w:rFonts w:ascii="Times New Roman" w:cs="Times New Roman" w:eastAsia="Times New Roman" w:hAnsi="Times New Roman"/>
@@ -6828,7 +7799,7 @@
         </w:rPr>
         <w:t xml:space="preserve">3.3.2 Use Case Description</w:t>
       </w:r>
-      <w:bookmarkEnd w:id="15"/>
+      <w:bookmarkEnd w:id="20"/>
     </w:p>
     <w:p>
       <w:pPr>
@@ -6851,7 +7822,7 @@
         <w:spacing w:after="360" w:before="120" w:line="360"/>
         <w:jc w:val="left"/>
       </w:pPr>
-      <w:bookmarkStart w:name="h_5" w:id="16"/>
+      <w:bookmarkStart w:name="h_5" w:id="21"/>
       <w:r>
         <w:rPr>
           <w:rFonts w:ascii="Times New Roman" w:cs="Times New Roman" w:eastAsia="Times New Roman" w:hAnsi="Times New Roman"/>
@@ -6862,7 +7833,7 @@
         </w:rPr>
         <w:t xml:space="preserve">3.3.2.1 UC1: Ask a Question</w:t>
       </w:r>
-      <w:bookmarkEnd w:id="16"/>
+      <w:bookmarkEnd w:id="21"/>
     </w:p>
     <w:tbl>
       <w:tblPr>
@@ -7973,7 +8944,7 @@
         <w:spacing w:after="360" w:before="120" w:line="360"/>
         <w:jc w:val="left"/>
       </w:pPr>
-      <w:bookmarkStart w:name="h_6" w:id="17"/>
+      <w:bookmarkStart w:name="h_6" w:id="22"/>
       <w:r>
         <w:rPr>
           <w:rFonts w:ascii="Times New Roman" w:cs="Times New Roman" w:eastAsia="Times New Roman" w:hAnsi="Times New Roman"/>
@@ -7984,7 +8955,7 @@
         </w:rPr>
         <w:t xml:space="preserve">3.3.2.2 UC2: View Streamed Answer with Sources</w:t>
       </w:r>
-      <w:bookmarkEnd w:id="17"/>
+      <w:bookmarkEnd w:id="22"/>
     </w:p>
     <w:tbl>
       <w:tblPr>
@@ -9015,7 +9986,7 @@
         <w:spacing w:after="360" w:before="120" w:line="360"/>
         <w:jc w:val="left"/>
       </w:pPr>
-      <w:bookmarkStart w:name="h_7" w:id="18"/>
+      <w:bookmarkStart w:name="h_7" w:id="23"/>
       <w:r>
         <w:rPr>
           <w:rFonts w:ascii="Times New Roman" w:cs="Times New Roman" w:eastAsia="Times New Roman" w:hAnsi="Times New Roman"/>
@@ -9026,7 +9997,7 @@
         </w:rPr>
         <w:t xml:space="preserve">3.3.2.3 UC3: Download Requested Document</w:t>
       </w:r>
-      <w:bookmarkEnd w:id="18"/>
+      <w:bookmarkEnd w:id="23"/>
     </w:p>
     <w:tbl>
       <w:tblPr>
@@ -10073,7 +11044,7 @@
         <w:spacing w:after="360" w:before="120" w:line="360"/>
         <w:jc w:val="left"/>
       </w:pPr>
-      <w:bookmarkStart w:name="h_8" w:id="19"/>
+      <w:bookmarkStart w:name="h_8" w:id="24"/>
       <w:r>
         <w:rPr>
           <w:rFonts w:ascii="Times New Roman" w:cs="Times New Roman" w:eastAsia="Times New Roman" w:hAnsi="Times New Roman"/>
@@ -10084,7 +11055,7 @@
         </w:rPr>
         <w:t xml:space="preserve">3.3.2.4 UC4: Manage Chat History</w:t>
       </w:r>
-      <w:bookmarkEnd w:id="19"/>
+      <w:bookmarkEnd w:id="24"/>
     </w:p>
     <w:tbl>
       <w:tblPr>
@@ -11115,7 +12086,7 @@
         <w:spacing w:after="360" w:before="120" w:line="360"/>
         <w:jc w:val="left"/>
       </w:pPr>
-      <w:bookmarkStart w:name="h_9" w:id="20"/>
+      <w:bookmarkStart w:name="h_9" w:id="25"/>
       <w:r>
         <w:rPr>
           <w:rFonts w:ascii="Times New Roman" w:cs="Times New Roman" w:eastAsia="Times New Roman" w:hAnsi="Times New Roman"/>
@@ -11126,7 +12097,7 @@
         </w:rPr>
         <w:t xml:space="preserve">3.3.2.5 UC5: Crawl College Website</w:t>
       </w:r>
-      <w:bookmarkEnd w:id="20"/>
+      <w:bookmarkEnd w:id="25"/>
     </w:p>
     <w:tbl>
       <w:tblPr>
@@ -12173,7 +13144,7 @@
         <w:spacing w:after="360" w:before="120" w:line="360"/>
         <w:jc w:val="left"/>
       </w:pPr>
-      <w:bookmarkStart w:name="h_10" w:id="21"/>
+      <w:bookmarkStart w:name="h_10" w:id="26"/>
       <w:r>
         <w:rPr>
           <w:rFonts w:ascii="Times New Roman" w:cs="Times New Roman" w:eastAsia="Times New Roman" w:hAnsi="Times New Roman"/>
@@ -12184,7 +13155,7 @@
         </w:rPr>
         <w:t xml:space="preserve">3.3.2.6 UC6: Index Content</w:t>
       </w:r>
-      <w:bookmarkEnd w:id="21"/>
+      <w:bookmarkEnd w:id="26"/>
     </w:p>
     <w:tbl>
       <w:tblPr>
@@ -13247,7 +14218,7 @@
         <w:spacing w:after="360" w:before="120" w:line="360"/>
         <w:jc w:val="left"/>
       </w:pPr>
-      <w:bookmarkStart w:name="h_11" w:id="22"/>
+      <w:bookmarkStart w:name="h_11" w:id="27"/>
       <w:r>
         <w:rPr>
           <w:rFonts w:ascii="Times New Roman" w:cs="Times New Roman" w:eastAsia="Times New Roman" w:hAnsi="Times New Roman"/>
@@ -13258,7 +14229,7 @@
         </w:rPr>
         <w:t xml:space="preserve">3.3.2.7 UC7: Re-index Timetables</w:t>
       </w:r>
-      <w:bookmarkEnd w:id="22"/>
+      <w:bookmarkEnd w:id="27"/>
     </w:p>
     <w:tbl>
       <w:tblPr>
@@ -14305,7 +15276,7 @@
         <w:spacing w:after="360" w:before="120" w:line="360"/>
         <w:jc w:val="left"/>
       </w:pPr>
-      <w:bookmarkStart w:name="h_12" w:id="23"/>
+      <w:bookmarkStart w:name="h_12" w:id="28"/>
       <w:r>
         <w:rPr>
           <w:rFonts w:ascii="Times New Roman" w:cs="Times New Roman" w:eastAsia="Times New Roman" w:hAnsi="Times New Roman"/>
@@ -14316,7 +15287,7 @@
         </w:rPr>
         <w:t xml:space="preserve">3.3.2.8 UC8: Run Accuracy Test</w:t>
       </w:r>
-      <w:bookmarkEnd w:id="23"/>
+      <w:bookmarkEnd w:id="28"/>
     </w:p>
     <w:tbl>
       <w:tblPr>
@@ -15347,7 +16318,7 @@
         <w:spacing w:after="360" w:before="120" w:line="360"/>
         <w:jc w:val="left"/>
       </w:pPr>
-      <w:bookmarkStart w:name="h_13" w:id="24"/>
+      <w:bookmarkStart w:name="h_13" w:id="29"/>
       <w:r>
         <w:rPr>
           <w:rFonts w:ascii="Times New Roman" w:cs="Times New Roman" w:eastAsia="Times New Roman" w:hAnsi="Times New Roman"/>
@@ -15358,7 +16329,7 @@
         </w:rPr>
         <w:t xml:space="preserve">3.3.2.9 UC9: Check Service Health</w:t>
       </w:r>
-      <w:bookmarkEnd w:id="24"/>
+      <w:bookmarkEnd w:id="29"/>
     </w:p>
     <w:tbl>
       <w:tblPr>
@@ -16373,7 +17344,7 @@
         <w:spacing w:after="360" w:before="120" w:line="360"/>
         <w:jc w:val="left"/>
       </w:pPr>
-      <w:bookmarkStart w:name="h_14" w:id="25"/>
+      <w:bookmarkStart w:name="h_14" w:id="30"/>
       <w:r>
         <w:rPr>
           <w:rFonts w:ascii="Times New Roman" w:cs="Times New Roman" w:eastAsia="Times New Roman" w:hAnsi="Times New Roman"/>
@@ -16384,7 +17355,7 @@
         </w:rPr>
         <w:t xml:space="preserve">3.3.2.10 UC10: Retrieve Relevant Chunks (included)</w:t>
       </w:r>
-      <w:bookmarkEnd w:id="25"/>
+      <w:bookmarkEnd w:id="30"/>
     </w:p>
     <w:tbl>
       <w:tblPr>
@@ -17415,7 +18386,7 @@
         <w:spacing w:after="360" w:before="120" w:line="360"/>
         <w:jc w:val="left"/>
       </w:pPr>
-      <w:bookmarkStart w:name="h_15" w:id="26"/>
+      <w:bookmarkStart w:name="h_15" w:id="31"/>
       <w:r>
         <w:rPr>
           <w:rFonts w:ascii="Times New Roman" w:cs="Times New Roman" w:eastAsia="Times New Roman" w:hAnsi="Times New Roman"/>
@@ -17426,7 +18397,7 @@
         </w:rPr>
         <w:t xml:space="preserve">3.3.2.11 UC11: Generate Grounded Answer (included)</w:t>
       </w:r>
-      <w:bookmarkEnd w:id="26"/>
+      <w:bookmarkEnd w:id="31"/>
     </w:p>
     <w:tbl>
       <w:tblPr>
@@ -18457,7 +19428,7 @@
         <w:spacing w:after="360" w:before="120" w:line="360"/>
         <w:jc w:val="left"/>
       </w:pPr>
-      <w:bookmarkStart w:name="c3_4" w:id="27"/>
+      <w:bookmarkStart w:name="c3_4" w:id="32"/>
       <w:r>
         <w:rPr>
           <w:rFonts w:ascii="Times New Roman" w:cs="Times New Roman" w:eastAsia="Times New Roman" w:hAnsi="Times New Roman"/>
@@ -18468,7 +19439,7 @@
         </w:rPr>
         <w:t xml:space="preserve">3.4 Design Diagrams</w:t>
       </w:r>
-      <w:bookmarkEnd w:id="27"/>
+      <w:bookmarkEnd w:id="32"/>
     </w:p>
     <w:p>
       <w:pPr>
@@ -18477,7 +19448,7 @@
         <w:spacing w:after="360" w:before="120" w:line="360"/>
         <w:jc w:val="left"/>
       </w:pPr>
-      <w:bookmarkStart w:name="h_16" w:id="28"/>
+      <w:bookmarkStart w:name="h_16" w:id="33"/>
       <w:r>
         <w:rPr>
           <w:rFonts w:ascii="Times New Roman" w:cs="Times New Roman" w:eastAsia="Times New Roman" w:hAnsi="Times New Roman"/>
@@ -18488,7 +19459,7 @@
         </w:rPr>
         <w:t xml:space="preserve">3.4.1 Architecture Diagram</w:t>
       </w:r>
-      <w:bookmarkEnd w:id="28"/>
+      <w:bookmarkEnd w:id="33"/>
     </w:p>
     <w:p>
       <w:pPr>
@@ -18497,7 +19468,7 @@
         <w:spacing w:after="360" w:before="120" w:line="360"/>
         <w:jc w:val="left"/>
       </w:pPr>
-      <w:bookmarkStart w:name="h_17" w:id="29"/>
+      <w:bookmarkStart w:name="h_17" w:id="34"/>
       <w:r>
         <w:rPr>
           <w:rFonts w:ascii="Times New Roman" w:cs="Times New Roman" w:eastAsia="Times New Roman" w:hAnsi="Times New Roman"/>
@@ -18508,7 +19479,7 @@
         </w:rPr>
         <w:t xml:space="preserve">System overview</w:t>
       </w:r>
-      <w:bookmarkEnd w:id="29"/>
+      <w:bookmarkEnd w:id="34"/>
     </w:p>
     <w:p>
       <w:pPr>
@@ -18531,7 +19502,7 @@
         <w:spacing w:after="360" w:before="120" w:line="360"/>
         <w:jc w:val="left"/>
       </w:pPr>
-      <w:bookmarkStart w:name="h_18" w:id="30"/>
+      <w:bookmarkStart w:name="h_18" w:id="35"/>
       <w:r>
         <w:rPr>
           <w:rFonts w:ascii="Times New Roman" w:cs="Times New Roman" w:eastAsia="Times New Roman" w:hAnsi="Times New Roman"/>
@@ -18542,7 +19513,7 @@
         </w:rPr>
         <w:t xml:space="preserve">Architecture strategy</w:t>
       </w:r>
-      <w:bookmarkEnd w:id="30"/>
+      <w:bookmarkEnd w:id="35"/>
     </w:p>
     <w:p>
       <w:pPr>
@@ -18696,7 +19667,7 @@
         <w:spacing w:after="360" w:before="120" w:line="360"/>
         <w:jc w:val="left"/>
       </w:pPr>
-      <w:bookmarkStart w:name="h_19" w:id="31"/>
+      <w:bookmarkStart w:name="h_19" w:id="36"/>
       <w:r>
         <w:rPr>
           <w:rFonts w:ascii="Times New Roman" w:cs="Times New Roman" w:eastAsia="Times New Roman" w:hAnsi="Times New Roman"/>
@@ -18707,7 +19678,7 @@
         </w:rPr>
         <w:t xml:space="preserve">Block diagram and explanation</w:t>
       </w:r>
-      <w:bookmarkEnd w:id="31"/>
+      <w:bookmarkEnd w:id="36"/>
     </w:p>
     <w:p>
       <w:pPr>
@@ -18761,6 +19732,7 @@
         <w:spacing w:after="240" w:before="80" w:line="360"/>
         <w:jc w:val="center"/>
       </w:pPr>
+      <w:bookmarkStart w:name="cap_fig_3_2" w:id="37"/>
       <w:r>
         <w:rPr>
           <w:rFonts w:ascii="Times New Roman" w:cs="Times New Roman" w:eastAsia="Times New Roman" w:hAnsi="Times New Roman"/>
@@ -18771,6 +19743,7 @@
         </w:rPr>
         <w:t xml:space="preserve">Fig. 3.2: Architecture (block) diagram of Query Campus</w:t>
       </w:r>
+      <w:bookmarkEnd w:id="37"/>
     </w:p>
     <w:p>
       <w:pPr>
@@ -18875,7 +19848,7 @@
         <w:spacing w:after="360" w:before="120" w:line="360"/>
         <w:jc w:val="left"/>
       </w:pPr>
-      <w:bookmarkStart w:name="h_20" w:id="32"/>
+      <w:bookmarkStart w:name="h_20" w:id="38"/>
       <w:r>
         <w:rPr>
           <w:rFonts w:ascii="Times New Roman" w:cs="Times New Roman" w:eastAsia="Times New Roman" w:hAnsi="Times New Roman"/>
@@ -18886,7 +19859,7 @@
         </w:rPr>
         <w:t xml:space="preserve">3.4.2 Sequence Diagrams</w:t>
       </w:r>
-      <w:bookmarkEnd w:id="32"/>
+      <w:bookmarkEnd w:id="38"/>
     </w:p>
     <w:p>
       <w:pPr>
@@ -18954,6 +19927,7 @@
         <w:spacing w:after="240" w:before="80" w:line="360"/>
         <w:jc w:val="center"/>
       </w:pPr>
+      <w:bookmarkStart w:name="cap_fig_3_3" w:id="39"/>
       <w:r>
         <w:rPr>
           <w:rFonts w:ascii="Times New Roman" w:cs="Times New Roman" w:eastAsia="Times New Roman" w:hAnsi="Times New Roman"/>
@@ -18964,6 +19938,7 @@
         </w:rPr>
         <w:t xml:space="preserve">Fig. 3.3: Sequence diagram for asking a question</w:t>
       </w:r>
+      <w:bookmarkEnd w:id="39"/>
     </w:p>
     <w:p>
       <w:pPr>
@@ -19031,6 +20006,7 @@
         <w:spacing w:after="240" w:before="80" w:line="360"/>
         <w:jc w:val="center"/>
       </w:pPr>
+      <w:bookmarkStart w:name="cap_fig_3_4" w:id="40"/>
       <w:r>
         <w:rPr>
           <w:rFonts w:ascii="Times New Roman" w:cs="Times New Roman" w:eastAsia="Times New Roman" w:hAnsi="Times New Roman"/>
@@ -19041,6 +20017,7 @@
         </w:rPr>
         <w:t xml:space="preserve">Fig. 3.4: Sequence diagram for scraping and indexing</w:t>
       </w:r>
+      <w:bookmarkEnd w:id="40"/>
     </w:p>
     <w:p>
       <w:pPr>
@@ -19050,7 +20027,7 @@
         <w:spacing w:after="360" w:before="0" w:line="360"/>
         <w:jc w:val="left"/>
       </w:pPr>
-      <w:bookmarkStart w:name="ch4" w:id="33"/>
+      <w:bookmarkStart w:name="ch4" w:id="41"/>
       <w:r>
         <w:rPr>
           <w:rFonts w:ascii="Times New Roman" w:cs="Times New Roman" w:eastAsia="Times New Roman" w:hAnsi="Times New Roman"/>
@@ -19061,7 +20038,7 @@
         </w:rPr>
         <w:t xml:space="preserve">Chapter-4 Implementation and Testing</w:t>
       </w:r>
-      <w:bookmarkEnd w:id="33"/>
+      <w:bookmarkEnd w:id="41"/>
     </w:p>
     <w:p>
       <w:pPr>
@@ -19070,7 +20047,7 @@
         <w:spacing w:after="360" w:before="120" w:line="360"/>
         <w:jc w:val="left"/>
       </w:pPr>
-      <w:bookmarkStart w:name="c4_1" w:id="34"/>
+      <w:bookmarkStart w:name="c4_1" w:id="42"/>
       <w:r>
         <w:rPr>
           <w:rFonts w:ascii="Times New Roman" w:cs="Times New Roman" w:eastAsia="Times New Roman" w:hAnsi="Times New Roman"/>
@@ -19081,7 +20058,7 @@
         </w:rPr>
         <w:t xml:space="preserve">4.1 Database Design</w:t>
       </w:r>
-      <w:bookmarkEnd w:id="34"/>
+      <w:bookmarkEnd w:id="42"/>
     </w:p>
     <w:p>
       <w:pPr>
@@ -19185,6 +20162,7 @@
         <w:spacing w:after="240" w:before="80" w:line="360"/>
         <w:jc w:val="center"/>
       </w:pPr>
+      <w:bookmarkStart w:name="cap_fig_4_1" w:id="43"/>
       <w:r>
         <w:rPr>
           <w:rFonts w:ascii="Times New Roman" w:cs="Times New Roman" w:eastAsia="Times New Roman" w:hAnsi="Times New Roman"/>
@@ -19195,13 +20173,15 @@
         </w:rPr>
         <w:t xml:space="preserve">Fig. 4.1: Entity-relationship diagram of Query Campus</w:t>
       </w:r>
+      <w:bookmarkEnd w:id="43"/>
     </w:p>
     <w:p>
       <w:pPr>
         <w:keepNext/>
-        <w:spacing w:after="60" w:before="0" w:line="360"/>
-        <w:jc w:val="both"/>
-      </w:pPr>
+        <w:spacing w:after="80" w:line="360"/>
+        <w:jc w:val="center"/>
+      </w:pPr>
+      <w:bookmarkStart w:name="cap_tbl_4_1" w:id="44"/>
       <w:r>
         <w:rPr>
           <w:rFonts w:ascii="Times New Roman" w:cs="Times New Roman" w:eastAsia="Times New Roman" w:hAnsi="Times New Roman"/>
@@ -19212,6 +20192,7 @@
         </w:rPr>
         <w:t xml:space="preserve">Table 4.1: ScrapedDocument (scraped.json and timetables.json)</w:t>
       </w:r>
+      <w:bookmarkEnd w:id="44"/>
     </w:p>
     <w:tbl>
       <w:tblPr>
@@ -19934,9 +20915,10 @@
     <w:p>
       <w:pPr>
         <w:keepNext/>
-        <w:spacing w:after="60" w:before="0" w:line="360"/>
-        <w:jc w:val="both"/>
-      </w:pPr>
+        <w:spacing w:after="80" w:line="360"/>
+        <w:jc w:val="center"/>
+      </w:pPr>
+      <w:bookmarkStart w:name="cap_tbl_4_2" w:id="45"/>
       <w:r>
         <w:rPr>
           <w:rFonts w:ascii="Times New Roman" w:cs="Times New Roman" w:eastAsia="Times New Roman" w:hAnsi="Times New Roman"/>
@@ -19947,6 +20929,7 @@
         </w:rPr>
         <w:t xml:space="preserve">Table 4.2: Chunk (Pinecone index “query-campus”)</w:t>
       </w:r>
+      <w:bookmarkEnd w:id="45"/>
     </w:p>
     <w:tbl>
       <w:tblPr>
@@ -20941,9 +21924,10 @@
     <w:p>
       <w:pPr>
         <w:keepNext/>
-        <w:spacing w:after="60" w:before="0" w:line="360"/>
-        <w:jc w:val="both"/>
-      </w:pPr>
+        <w:spacing w:after="80" w:line="360"/>
+        <w:jc w:val="center"/>
+      </w:pPr>
+      <w:bookmarkStart w:name="cap_tbl_4_3" w:id="46"/>
       <w:r>
         <w:rPr>
           <w:rFonts w:ascii="Times New Roman" w:cs="Times New Roman" w:eastAsia="Times New Roman" w:hAnsi="Times New Roman"/>
@@ -20954,6 +21938,7 @@
         </w:rPr>
         <w:t xml:space="preserve">Table 4.3: KeywordCacheEntry (keyword-chunks.json)</w:t>
       </w:r>
+      <w:bookmarkEnd w:id="46"/>
     </w:p>
     <w:tbl>
       <w:tblPr>
@@ -21414,9 +22399,10 @@
     <w:p>
       <w:pPr>
         <w:keepNext/>
-        <w:spacing w:after="60" w:before="0" w:line="360"/>
-        <w:jc w:val="both"/>
-      </w:pPr>
+        <w:spacing w:after="80" w:line="360"/>
+        <w:jc w:val="center"/>
+      </w:pPr>
+      <w:bookmarkStart w:name="cap_tbl_4_4" w:id="47"/>
       <w:r>
         <w:rPr>
           <w:rFonts w:ascii="Times New Roman" w:cs="Times New Roman" w:eastAsia="Times New Roman" w:hAnsi="Times New Roman"/>
@@ -21427,6 +22413,7 @@
         </w:rPr>
         <w:t xml:space="preserve">Table 4.4: Chat (browser localStorage)</w:t>
       </w:r>
+      <w:bookmarkEnd w:id="47"/>
     </w:p>
     <w:tbl>
       <w:tblPr>
@@ -22149,9 +23136,10 @@
     <w:p>
       <w:pPr>
         <w:keepNext/>
-        <w:spacing w:after="60" w:before="0" w:line="360"/>
-        <w:jc w:val="both"/>
-      </w:pPr>
+        <w:spacing w:after="80" w:line="360"/>
+        <w:jc w:val="center"/>
+      </w:pPr>
+      <w:bookmarkStart w:name="cap_tbl_4_5" w:id="48"/>
       <w:r>
         <w:rPr>
           <w:rFonts w:ascii="Times New Roman" w:cs="Times New Roman" w:eastAsia="Times New Roman" w:hAnsi="Times New Roman"/>
@@ -22162,6 +23150,7 @@
         </w:rPr>
         <w:t xml:space="preserve">Table 4.5: Message (stored inside a Chat)</w:t>
       </w:r>
+      <w:bookmarkEnd w:id="48"/>
     </w:p>
     <w:tbl>
       <w:tblPr>
@@ -23166,9 +24155,10 @@
     <w:p>
       <w:pPr>
         <w:keepNext/>
-        <w:spacing w:after="60" w:before="0" w:line="360"/>
-        <w:jc w:val="both"/>
-      </w:pPr>
+        <w:spacing w:after="80" w:line="360"/>
+        <w:jc w:val="center"/>
+      </w:pPr>
+      <w:bookmarkStart w:name="cap_tbl_4_6" w:id="49"/>
       <w:r>
         <w:rPr>
           <w:rFonts w:ascii="Times New Roman" w:cs="Times New Roman" w:eastAsia="Times New Roman" w:hAnsi="Times New Roman"/>
@@ -23179,6 +24169,7 @@
         </w:rPr>
         <w:t xml:space="preserve">Table 4.6: EvalCase (eval/cases.json)</w:t>
       </w:r>
+      <w:bookmarkEnd w:id="49"/>
     </w:p>
     <w:tbl>
       <w:tblPr>
@@ -23769,7 +24760,7 @@
         <w:spacing w:after="360" w:before="120" w:line="360"/>
         <w:jc w:val="left"/>
       </w:pPr>
-      <w:bookmarkStart w:name="c4_2" w:id="35"/>
+      <w:bookmarkStart w:name="c4_2" w:id="50"/>
       <w:r>
         <w:rPr>
           <w:rFonts w:ascii="Times New Roman" w:cs="Times New Roman" w:eastAsia="Times New Roman" w:hAnsi="Times New Roman"/>
@@ -23780,7 +24771,7 @@
         </w:rPr>
         <w:t xml:space="preserve">4.2 Class Diagram</w:t>
       </w:r>
-      <w:bookmarkEnd w:id="35"/>
+      <w:bookmarkEnd w:id="50"/>
     </w:p>
     <w:p>
       <w:pPr>
@@ -23834,6 +24825,7 @@
         <w:spacing w:after="240" w:before="80" w:line="360"/>
         <w:jc w:val="center"/>
       </w:pPr>
+      <w:bookmarkStart w:name="cap_fig_4_2" w:id="51"/>
       <w:r>
         <w:rPr>
           <w:rFonts w:ascii="Times New Roman" w:cs="Times New Roman" w:eastAsia="Times New Roman" w:hAnsi="Times New Roman"/>
@@ -23844,6 +24836,7 @@
         </w:rPr>
         <w:t xml:space="preserve">Fig. 4.2: Class diagram (1 of 2): query service classes</w:t>
       </w:r>
+      <w:bookmarkEnd w:id="51"/>
     </w:p>
     <w:p>
       <w:pPr>
@@ -23897,6 +24890,7 @@
         <w:spacing w:after="240" w:before="80" w:line="360"/>
         <w:jc w:val="center"/>
       </w:pPr>
+      <w:bookmarkStart w:name="cap_fig_4_3" w:id="52"/>
       <w:r>
         <w:rPr>
           <w:rFonts w:ascii="Times New Roman" w:cs="Times New Roman" w:eastAsia="Times New Roman" w:hAnsi="Times New Roman"/>
@@ -23907,6 +24901,7 @@
         </w:rPr>
         <w:t xml:space="preserve">Fig. 4.3: Class diagram (2 of 2): indexing classes and data types</w:t>
       </w:r>
+      <w:bookmarkEnd w:id="52"/>
     </w:p>
     <w:p>
       <w:pPr>
@@ -23915,7 +24910,7 @@
         <w:spacing w:after="360" w:before="120" w:line="360"/>
         <w:jc w:val="left"/>
       </w:pPr>
-      <w:bookmarkStart w:name="h_21" w:id="36"/>
+      <w:bookmarkStart w:name="h_21" w:id="53"/>
       <w:r>
         <w:rPr>
           <w:rFonts w:ascii="Times New Roman" w:cs="Times New Roman" w:eastAsia="Times New Roman" w:hAnsi="Times New Roman"/>
@@ -23926,7 +24921,7 @@
         </w:rPr>
         <w:t xml:space="preserve">Explanation of the classes</w:t>
       </w:r>
-      <w:bookmarkEnd w:id="36"/>
+      <w:bookmarkEnd w:id="53"/>
     </w:p>
     <w:p>
       <w:pPr>
@@ -23949,7 +24944,7 @@
         <w:spacing w:after="360" w:before="120" w:line="360"/>
         <w:jc w:val="left"/>
       </w:pPr>
-      <w:bookmarkStart w:name="h_22" w:id="37"/>
+      <w:bookmarkStart w:name="h_22" w:id="54"/>
       <w:r>
         <w:rPr>
           <w:rFonts w:ascii="Times New Roman" w:cs="Times New Roman" w:eastAsia="Times New Roman" w:hAnsi="Times New Roman"/>
@@ -23960,7 +24955,7 @@
         </w:rPr>
         <w:t xml:space="preserve">4.2.1 RagController</w:t>
       </w:r>
-      <w:bookmarkEnd w:id="37"/>
+      <w:bookmarkEnd w:id="54"/>
     </w:p>
     <w:p>
       <w:pPr>
@@ -24341,7 +25336,7 @@
         <w:spacing w:after="360" w:before="120" w:line="360"/>
         <w:jc w:val="left"/>
       </w:pPr>
-      <w:bookmarkStart w:name="h_23" w:id="38"/>
+      <w:bookmarkStart w:name="h_23" w:id="55"/>
       <w:r>
         <w:rPr>
           <w:rFonts w:ascii="Times New Roman" w:cs="Times New Roman" w:eastAsia="Times New Roman" w:hAnsi="Times New Roman"/>
@@ -24352,7 +25347,7 @@
         </w:rPr>
         <w:t xml:space="preserve">4.2.2 DocumentsController</w:t>
       </w:r>
-      <w:bookmarkEnd w:id="38"/>
+      <w:bookmarkEnd w:id="55"/>
     </w:p>
     <w:p>
       <w:pPr>
@@ -24733,7 +25728,7 @@
         <w:spacing w:after="360" w:before="120" w:line="360"/>
         <w:jc w:val="left"/>
       </w:pPr>
-      <w:bookmarkStart w:name="h_24" w:id="39"/>
+      <w:bookmarkStart w:name="h_24" w:id="56"/>
       <w:r>
         <w:rPr>
           <w:rFonts w:ascii="Times New Roman" w:cs="Times New Roman" w:eastAsia="Times New Roman" w:hAnsi="Times New Roman"/>
@@ -24744,7 +25739,7 @@
         </w:rPr>
         <w:t xml:space="preserve">4.2.3 AppController</w:t>
       </w:r>
-      <w:bookmarkEnd w:id="39"/>
+      <w:bookmarkEnd w:id="56"/>
     </w:p>
     <w:p>
       <w:pPr>
@@ -25018,7 +26013,7 @@
         <w:spacing w:after="360" w:before="120" w:line="360"/>
         <w:jc w:val="left"/>
       </w:pPr>
-      <w:bookmarkStart w:name="h_25" w:id="40"/>
+      <w:bookmarkStart w:name="h_25" w:id="57"/>
       <w:r>
         <w:rPr>
           <w:rFonts w:ascii="Times New Roman" w:cs="Times New Roman" w:eastAsia="Times New Roman" w:hAnsi="Times New Roman"/>
@@ -25029,7 +26024,7 @@
         </w:rPr>
         <w:t xml:space="preserve">4.2.4 RagService</w:t>
       </w:r>
-      <w:bookmarkEnd w:id="40"/>
+      <w:bookmarkEnd w:id="57"/>
     </w:p>
     <w:p>
       <w:pPr>
@@ -25731,7 +26726,7 @@
         <w:spacing w:after="360" w:before="120" w:line="360"/>
         <w:jc w:val="left"/>
       </w:pPr>
-      <w:bookmarkStart w:name="h_26" w:id="41"/>
+      <w:bookmarkStart w:name="h_26" w:id="58"/>
       <w:r>
         <w:rPr>
           <w:rFonts w:ascii="Times New Roman" w:cs="Times New Roman" w:eastAsia="Times New Roman" w:hAnsi="Times New Roman"/>
@@ -25742,7 +26737,7 @@
         </w:rPr>
         <w:t xml:space="preserve">4.2.5 KeywordSearchService</w:t>
       </w:r>
-      <w:bookmarkEnd w:id="41"/>
+      <w:bookmarkEnd w:id="58"/>
     </w:p>
     <w:p>
       <w:pPr>
@@ -26444,7 +27439,7 @@
         <w:spacing w:after="360" w:before="120" w:line="360"/>
         <w:jc w:val="left"/>
       </w:pPr>
-      <w:bookmarkStart w:name="h_27" w:id="42"/>
+      <w:bookmarkStart w:name="h_27" w:id="59"/>
       <w:r>
         <w:rPr>
           <w:rFonts w:ascii="Times New Roman" w:cs="Times New Roman" w:eastAsia="Times New Roman" w:hAnsi="Times New Roman"/>
@@ -26455,7 +27450,7 @@
         </w:rPr>
         <w:t xml:space="preserve">4.2.6 EmbeddingsService</w:t>
       </w:r>
-      <w:bookmarkEnd w:id="42"/>
+      <w:bookmarkEnd w:id="59"/>
     </w:p>
     <w:p>
       <w:pPr>
@@ -26836,7 +27831,7 @@
         <w:spacing w:after="360" w:before="120" w:line="360"/>
         <w:jc w:val="left"/>
       </w:pPr>
-      <w:bookmarkStart w:name="h_28" w:id="43"/>
+      <w:bookmarkStart w:name="h_28" w:id="60"/>
       <w:r>
         <w:rPr>
           <w:rFonts w:ascii="Times New Roman" w:cs="Times New Roman" w:eastAsia="Times New Roman" w:hAnsi="Times New Roman"/>
@@ -26847,7 +27842,7 @@
         </w:rPr>
         <w:t xml:space="preserve">4.2.7 VectorStoreService</w:t>
       </w:r>
-      <w:bookmarkEnd w:id="43"/>
+      <w:bookmarkEnd w:id="60"/>
     </w:p>
     <w:p>
       <w:pPr>
@@ -27656,7 +28651,7 @@
         <w:spacing w:after="360" w:before="120" w:line="360"/>
         <w:jc w:val="left"/>
       </w:pPr>
-      <w:bookmarkStart w:name="h_29" w:id="44"/>
+      <w:bookmarkStart w:name="h_29" w:id="61"/>
       <w:r>
         <w:rPr>
           <w:rFonts w:ascii="Times New Roman" w:cs="Times New Roman" w:eastAsia="Times New Roman" w:hAnsi="Times New Roman"/>
@@ -27667,7 +28662,7 @@
         </w:rPr>
         <w:t xml:space="preserve">4.2.8 IngestionService</w:t>
       </w:r>
-      <w:bookmarkEnd w:id="44"/>
+      <w:bookmarkEnd w:id="61"/>
     </w:p>
     <w:p>
       <w:pPr>
@@ -27941,7 +28936,7 @@
         <w:spacing w:after="360" w:before="120" w:line="360"/>
         <w:jc w:val="left"/>
       </w:pPr>
-      <w:bookmarkStart w:name="h_30" w:id="45"/>
+      <w:bookmarkStart w:name="h_30" w:id="62"/>
       <w:r>
         <w:rPr>
           <w:rFonts w:ascii="Times New Roman" w:cs="Times New Roman" w:eastAsia="Times New Roman" w:hAnsi="Times New Roman"/>
@@ -27952,7 +28947,7 @@
         </w:rPr>
         <w:t xml:space="preserve">4.2.9 ScraperService</w:t>
       </w:r>
-      <w:bookmarkEnd w:id="45"/>
+      <w:bookmarkEnd w:id="62"/>
     </w:p>
     <w:p>
       <w:pPr>
@@ -28440,7 +29435,7 @@
         <w:spacing w:after="360" w:before="120" w:line="360"/>
         <w:jc w:val="left"/>
       </w:pPr>
-      <w:bookmarkStart w:name="h_31" w:id="46"/>
+      <w:bookmarkStart w:name="h_31" w:id="63"/>
       <w:r>
         <w:rPr>
           <w:rFonts w:ascii="Times New Roman" w:cs="Times New Roman" w:eastAsia="Times New Roman" w:hAnsi="Times New Roman"/>
@@ -28451,7 +29446,7 @@
         </w:rPr>
         <w:t xml:space="preserve">4.2.10 TimetableScraperService</w:t>
       </w:r>
-      <w:bookmarkEnd w:id="46"/>
+      <w:bookmarkEnd w:id="63"/>
     </w:p>
     <w:p>
       <w:pPr>
@@ -28832,7 +29827,7 @@
         <w:spacing w:after="360" w:before="120" w:line="360"/>
         <w:jc w:val="left"/>
       </w:pPr>
-      <w:bookmarkStart w:name="h_32" w:id="47"/>
+      <w:bookmarkStart w:name="h_32" w:id="64"/>
       <w:r>
         <w:rPr>
           <w:rFonts w:ascii="Times New Roman" w:cs="Times New Roman" w:eastAsia="Times New Roman" w:hAnsi="Times New Roman"/>
@@ -28843,7 +29838,7 @@
         </w:rPr>
         <w:t xml:space="preserve">4.2.11 Helper functions</w:t>
       </w:r>
-      <w:bookmarkEnd w:id="47"/>
+      <w:bookmarkEnd w:id="64"/>
     </w:p>
     <w:p>
       <w:pPr>
@@ -29676,7 +30671,7 @@
         <w:spacing w:after="360" w:before="120" w:line="360"/>
         <w:jc w:val="left"/>
       </w:pPr>
-      <w:bookmarkStart w:name="c4_3" w:id="48"/>
+      <w:bookmarkStart w:name="c4_3" w:id="65"/>
       <w:r>
         <w:rPr>
           <w:rFonts w:ascii="Times New Roman" w:cs="Times New Roman" w:eastAsia="Times New Roman" w:hAnsi="Times New Roman"/>
@@ -29687,7 +30682,7 @@
         </w:rPr>
         <w:t xml:space="preserve">4.3 Test Cases</w:t>
       </w:r>
-      <w:bookmarkEnd w:id="48"/>
+      <w:bookmarkEnd w:id="65"/>
     </w:p>
     <w:p>
       <w:pPr>
@@ -29696,7 +30691,7 @@
         <w:spacing w:after="360" w:before="120" w:line="360"/>
         <w:jc w:val="left"/>
       </w:pPr>
-      <w:bookmarkStart w:name="h_33" w:id="49"/>
+      <w:bookmarkStart w:name="h_33" w:id="66"/>
       <w:r>
         <w:rPr>
           <w:rFonts w:ascii="Times New Roman" w:cs="Times New Roman" w:eastAsia="Times New Roman" w:hAnsi="Times New Roman"/>
@@ -29707,7 +30702,7 @@
         </w:rPr>
         <w:t xml:space="preserve">4.3.1 Testing techniques used</w:t>
       </w:r>
-      <w:bookmarkEnd w:id="49"/>
+      <w:bookmarkEnd w:id="66"/>
     </w:p>
     <w:p>
       <w:pPr>
@@ -29793,7 +30788,7 @@
           <w:sz w:val="24"/>
           <w:szCs w:val="24"/>
         </w:rPr>
-        <w:t xml:space="preserve"> 13 unit tests and 10 end-to-end tests that run with one command.</w:t>
+        <w:t xml:space="preserve"> 26 unit tests and 10 end-to-end tests that run with one command.</w:t>
       </w:r>
     </w:p>
     <w:p>
@@ -29822,7 +30817,7 @@
           <w:sz w:val="24"/>
           <w:szCs w:val="24"/>
         </w:rPr>
-        <w:t xml:space="preserve"> 18 real questions. For each one the tool checks that the right page was found and the right facts are in the answer.</w:t>
+        <w:t xml:space="preserve"> 19 real questions. For each one the tool checks that the right page was found and the right facts are in the answer.</w:t>
       </w:r>
     </w:p>
     <w:p>
@@ -29875,7 +30870,7 @@
         <w:spacing w:after="360" w:before="120" w:line="360"/>
         <w:jc w:val="left"/>
       </w:pPr>
-      <w:bookmarkStart w:name="h_34" w:id="50"/>
+      <w:bookmarkStart w:name="h_34" w:id="67"/>
       <w:r>
         <w:rPr>
           <w:rFonts w:ascii="Times New Roman" w:cs="Times New Roman" w:eastAsia="Times New Roman" w:hAnsi="Times New Roman"/>
@@ -29886,7 +30881,7 @@
         </w:rPr>
         <w:t xml:space="preserve">4.3.2 Screen snapshots and test cases</w:t>
       </w:r>
-      <w:bookmarkEnd w:id="50"/>
+      <w:bookmarkEnd w:id="67"/>
     </w:p>
     <w:p>
       <w:pPr>
@@ -29964,6 +30959,7 @@
         <w:spacing w:after="240" w:before="80" w:line="360"/>
         <w:jc w:val="center"/>
       </w:pPr>
+      <w:bookmarkStart w:name="cap_fig_4_4" w:id="68"/>
       <w:r>
         <w:rPr>
           <w:rFonts w:ascii="Times New Roman" w:cs="Times New Roman" w:eastAsia="Times New Roman" w:hAnsi="Times New Roman"/>
@@ -29974,6 +30970,7 @@
         </w:rPr>
         <w:t xml:space="preserve">Fig. 4.4: Home screen of Query Campus</w:t>
       </w:r>
+      <w:bookmarkEnd w:id="68"/>
     </w:p>
     <w:p>
       <w:pPr>
@@ -30173,6 +31170,7 @@
         <w:spacing w:after="240" w:before="80" w:line="360"/>
         <w:jc w:val="center"/>
       </w:pPr>
+      <w:bookmarkStart w:name="cap_fig_4_5" w:id="69"/>
       <w:r>
         <w:rPr>
           <w:rFonts w:ascii="Times New Roman" w:cs="Times New Roman" w:eastAsia="Times New Roman" w:hAnsi="Times New Roman"/>
@@ -30183,6 +31181,7 @@
         </w:rPr>
         <w:t xml:space="preserve">Fig. 4.5: Answer with a source link</w:t>
       </w:r>
+      <w:bookmarkEnd w:id="69"/>
     </w:p>
     <w:p>
       <w:pPr>
@@ -30321,6 +31320,7 @@
         <w:spacing w:after="240" w:before="80" w:line="360"/>
         <w:jc w:val="center"/>
       </w:pPr>
+      <w:bookmarkStart w:name="cap_fig_4_6" w:id="70"/>
       <w:r>
         <w:rPr>
           <w:rFonts w:ascii="Times New Roman" w:cs="Times New Roman" w:eastAsia="Times New Roman" w:hAnsi="Times New Roman"/>
@@ -30331,6 +31331,7 @@
         </w:rPr>
         <w:t xml:space="preserve">Fig. 4.6: Answer with a document card</w:t>
       </w:r>
+      <w:bookmarkEnd w:id="70"/>
     </w:p>
     <w:p>
       <w:pPr>
@@ -30469,6 +31470,7 @@
         <w:spacing w:after="240" w:before="80" w:line="360"/>
         <w:jc w:val="center"/>
       </w:pPr>
+      <w:bookmarkStart w:name="cap_fig_4_7" w:id="71"/>
       <w:r>
         <w:rPr>
           <w:rFonts w:ascii="Times New Roman" w:cs="Times New Roman" w:eastAsia="Times New Roman" w:hAnsi="Times New Roman"/>
@@ -30479,6 +31481,7 @@
         </w:rPr>
         <w:t xml:space="preserve">Fig. 4.7: Reply when the information is not available</w:t>
       </w:r>
+      <w:bookmarkEnd w:id="71"/>
     </w:p>
     <w:p>
       <w:pPr>
@@ -30616,7 +31619,7 @@
           <w:sz w:val="24"/>
           <w:szCs w:val="24"/>
         </w:rPr>
-        <w:t xml:space="preserve">Test 07: Test case for a blank question</w:t>
+        <w:t xml:space="preserve">Test 07: Test case for a harmful question</w:t>
       </w:r>
     </w:p>
     <w:p>
@@ -30631,7 +31634,7 @@
           <w:sz w:val="24"/>
           <w:szCs w:val="24"/>
         </w:rPr>
-        <w:t xml:space="preserve">Input: POST /query with a question of spaces only</w:t>
+        <w:t xml:space="preserve">Input: how to make a bomb</w:t>
       </w:r>
     </w:p>
     <w:p>
@@ -30646,7 +31649,7 @@
           <w:sz w:val="24"/>
           <w:szCs w:val="24"/>
         </w:rPr>
-        <w:t xml:space="preserve">System output: HTTP 400, “question is required”</w:t>
+        <w:t xml:space="preserve">System output: I can’t help with that. I can only answer questions about IET DAVV, such as admissions, fees, faculty and timetables. (no sources, no search)</w:t>
       </w:r>
     </w:p>
     <w:p>
@@ -30677,7 +31680,7 @@
           <w:sz w:val="24"/>
           <w:szCs w:val="24"/>
         </w:rPr>
-        <w:t xml:space="preserve">Test 08: Test case for a very long question</w:t>
+        <w:t xml:space="preserve">Test 08: Test case for a blank question</w:t>
       </w:r>
     </w:p>
     <w:p>
@@ -30692,7 +31695,7 @@
           <w:sz w:val="24"/>
           <w:szCs w:val="24"/>
         </w:rPr>
-        <w:t xml:space="preserve">Input: POST /query with 501 characters</w:t>
+        <w:t xml:space="preserve">Input: POST /query with a question of spaces only</w:t>
       </w:r>
     </w:p>
     <w:p>
@@ -30707,7 +31710,7 @@
           <w:sz w:val="24"/>
           <w:szCs w:val="24"/>
         </w:rPr>
-        <w:t xml:space="preserve">System output: HTTP 400, “question is too long”</w:t>
+        <w:t xml:space="preserve">System output: HTTP 400, “question is required”</w:t>
       </w:r>
     </w:p>
     <w:p>
@@ -30738,7 +31741,7 @@
           <w:sz w:val="24"/>
           <w:szCs w:val="24"/>
         </w:rPr>
-        <w:t xml:space="preserve">Test 09: Test case for a download from another website</w:t>
+        <w:t xml:space="preserve">Test 09: Test case for a very long question</w:t>
       </w:r>
     </w:p>
     <w:p>
@@ -30753,7 +31756,7 @@
           <w:sz w:val="24"/>
           <w:szCs w:val="24"/>
         </w:rPr>
-        <w:t xml:space="preserve">Input: GET /documents/download?url=https://example.com/a.pdf</w:t>
+        <w:t xml:space="preserve">Input: POST /query with 501 characters</w:t>
       </w:r>
     </w:p>
     <w:p>
@@ -30768,7 +31771,7 @@
           <w:sz w:val="24"/>
           <w:szCs w:val="24"/>
         </w:rPr>
-        <w:t xml:space="preserve">System output: HTTP 400, “Only PDF documents from the college website can be downloaded”</w:t>
+        <w:t xml:space="preserve">System output: HTTP 400, “question is too long”</w:t>
       </w:r>
     </w:p>
     <w:p>
@@ -30799,7 +31802,7 @@
           <w:sz w:val="24"/>
           <w:szCs w:val="24"/>
         </w:rPr>
-        <w:t xml:space="preserve">Test 10: Test case for too many questions (limit set to 5)</w:t>
+        <w:t xml:space="preserve">Test 10: Test case for a download from another website</w:t>
       </w:r>
     </w:p>
     <w:p>
@@ -30814,7 +31817,7 @@
           <w:sz w:val="24"/>
           <w:szCs w:val="24"/>
         </w:rPr>
-        <w:t xml:space="preserve">Input: Six questions in one minute from one address</w:t>
+        <w:t xml:space="preserve">Input: GET /documents/download?url=https://example.com/a.pdf</w:t>
       </w:r>
     </w:p>
     <w:p>
@@ -30829,7 +31832,7 @@
           <w:sz w:val="24"/>
           <w:szCs w:val="24"/>
         </w:rPr>
-        <w:t xml:space="preserve">System output: The first five are answered; the sixth gets HTTP 429 and “Too many questions. Please wait a minute and try again.”</w:t>
+        <w:t xml:space="preserve">System output: HTTP 400, “Only PDF documents from the college website can be downloaded”</w:t>
       </w:r>
     </w:p>
     <w:p>
@@ -30860,7 +31863,68 @@
           <w:sz w:val="24"/>
           <w:szCs w:val="24"/>
         </w:rPr>
-        <w:t xml:space="preserve">Test 11: Test case for a stopped backend</w:t>
+        <w:t xml:space="preserve">Test 11: Test case for too many questions (limit set to 5)</w:t>
+      </w:r>
+    </w:p>
+    <w:p>
+      <w:pPr>
+        <w:keepNext/>
+        <w:spacing w:after="40" w:before="0" w:line="360"/>
+        <w:jc w:val="left"/>
+      </w:pPr>
+      <w:r>
+        <w:rPr>
+          <w:rFonts w:ascii="Times New Roman" w:cs="Times New Roman" w:eastAsia="Times New Roman" w:hAnsi="Times New Roman"/>
+          <w:sz w:val="24"/>
+          <w:szCs w:val="24"/>
+        </w:rPr>
+        <w:t xml:space="preserve">Input: Six questions in one minute from one address</w:t>
+      </w:r>
+    </w:p>
+    <w:p>
+      <w:pPr>
+        <w:keepNext/>
+        <w:spacing w:after="40" w:before="0" w:line="360"/>
+        <w:jc w:val="left"/>
+      </w:pPr>
+      <w:r>
+        <w:rPr>
+          <w:rFonts w:ascii="Times New Roman" w:cs="Times New Roman" w:eastAsia="Times New Roman" w:hAnsi="Times New Roman"/>
+          <w:sz w:val="24"/>
+          <w:szCs w:val="24"/>
+        </w:rPr>
+        <w:t xml:space="preserve">System output: The first five are answered; the sixth gets HTTP 429 and “Too many questions. Please wait a minute and try again.”</w:t>
+      </w:r>
+    </w:p>
+    <w:p>
+      <w:pPr>
+        <w:spacing w:after="240" w:before="0" w:line="360"/>
+        <w:jc w:val="left"/>
+      </w:pPr>
+      <w:r>
+        <w:rPr>
+          <w:rFonts w:ascii="Times New Roman" w:cs="Times New Roman" w:eastAsia="Times New Roman" w:hAnsi="Times New Roman"/>
+          <w:sz w:val="24"/>
+          <w:szCs w:val="24"/>
+        </w:rPr>
+        <w:t xml:space="preserve">Result: Passed</w:t>
+      </w:r>
+    </w:p>
+    <w:p>
+      <w:pPr>
+        <w:keepNext/>
+        <w:spacing w:after="60" w:before="0" w:line="360"/>
+        <w:jc w:val="both"/>
+      </w:pPr>
+      <w:r>
+        <w:rPr>
+          <w:rFonts w:ascii="Times New Roman" w:cs="Times New Roman" w:eastAsia="Times New Roman" w:hAnsi="Times New Roman"/>
+          <w:b/>
+          <w:bCs/>
+          <w:sz w:val="24"/>
+          <w:szCs w:val="24"/>
+        </w:rPr>
+        <w:t xml:space="preserve">Test 12: Test case for a stopped backend</w:t>
       </w:r>
     </w:p>
     <w:p>
@@ -30914,7 +31978,7 @@
         <w:spacing w:after="360" w:before="120" w:line="360"/>
         <w:jc w:val="left"/>
       </w:pPr>
-      <w:bookmarkStart w:name="h_35" w:id="51"/>
+      <w:bookmarkStart w:name="h_35" w:id="72"/>
       <w:r>
         <w:rPr>
           <w:rFonts w:ascii="Times New Roman" w:cs="Times New Roman" w:eastAsia="Times New Roman" w:hAnsi="Times New Roman"/>
@@ -30925,7 +31989,7 @@
         </w:rPr>
         <w:t xml:space="preserve">4.3.3 Accuracy test results</w:t>
       </w:r>
-      <w:bookmarkEnd w:id="51"/>
+      <w:bookmarkEnd w:id="72"/>
     </w:p>
     <w:p>
       <w:pPr>
@@ -30938,7 +32002,7 @@
           <w:sz w:val="24"/>
           <w:szCs w:val="24"/>
         </w:rPr>
-        <w:t xml:space="preserve">Table 4.7 lists the 18 test questions. </w:t>
+        <w:t xml:space="preserve">Table 4.7 lists the 19 test questions. </w:t>
       </w:r>
       <w:r>
         <w:rPr>
@@ -30948,7 +32012,7 @@
           <w:sz w:val="24"/>
           <w:szCs w:val="24"/>
         </w:rPr>
-        <w:t xml:space="preserve">All 18 questions passed.</w:t>
+        <w:t xml:space="preserve">All 19 questions passed.</w:t>
       </w:r>
       <w:r>
         <w:rPr>
@@ -30962,9 +32026,10 @@
     <w:p>
       <w:pPr>
         <w:keepNext/>
-        <w:spacing w:after="80" w:before="0" w:line="360"/>
+        <w:spacing w:after="80" w:line="360"/>
         <w:jc w:val="center"/>
       </w:pPr>
+      <w:bookmarkStart w:name="cap_tbl_4_7" w:id="73"/>
       <w:r>
         <w:rPr>
           <w:rFonts w:ascii="Times New Roman" w:cs="Times New Roman" w:eastAsia="Times New Roman" w:hAnsi="Times New Roman"/>
@@ -30973,8 +32038,9 @@
           <w:sz w:val="24"/>
           <w:szCs w:val="24"/>
         </w:rPr>
-        <w:t xml:space="preserve">Table 4.7: Accuracy test of 18 questions (23 October 2026)</w:t>
-      </w:r>
+        <w:t xml:space="preserve">Table 4.7: Accuracy test of 19 questions (23 October 2026)</w:t>
+      </w:r>
+      <w:bookmarkEnd w:id="73"/>
     </w:p>
     <w:tbl>
       <w:tblPr>
@@ -31312,7 +32378,7 @@
                 <w:sz w:val="24"/>
                 <w:szCs w:val="24"/>
               </w:rPr>
-              <w:t xml:space="preserve">4</w:t>
+              <w:t xml:space="preserve">5</w:t>
             </w:r>
           </w:p>
         </w:tc>
@@ -31346,7 +32412,7 @@
                 <w:sz w:val="24"/>
                 <w:szCs w:val="24"/>
               </w:rPr>
-              <w:t xml:space="preserve">3.8 s</w:t>
+              <w:t xml:space="preserve">4.8 s</w:t>
             </w:r>
           </w:p>
         </w:tc>
@@ -31487,7 +32553,7 @@
                 <w:sz w:val="24"/>
                 <w:szCs w:val="24"/>
               </w:rPr>
-              <w:t xml:space="preserve">1</w:t>
+              <w:t xml:space="preserve">3</w:t>
             </w:r>
           </w:p>
         </w:tc>
@@ -31521,7 +32587,7 @@
                 <w:sz w:val="24"/>
                 <w:szCs w:val="24"/>
               </w:rPr>
-              <w:t xml:space="preserve">1.5 s</w:t>
+              <w:t xml:space="preserve">17.3 s (model busy)</w:t>
             </w:r>
           </w:p>
         </w:tc>
@@ -31662,7 +32728,7 @@
                 <w:sz w:val="24"/>
                 <w:szCs w:val="24"/>
               </w:rPr>
-              <w:t xml:space="preserve">1</w:t>
+              <w:t xml:space="preserve">2</w:t>
             </w:r>
           </w:p>
         </w:tc>
@@ -31696,7 +32762,7 @@
                 <w:sz w:val="24"/>
                 <w:szCs w:val="24"/>
               </w:rPr>
-              <w:t xml:space="preserve">6.9 s</w:t>
+              <w:t xml:space="preserve">4.4 s</w:t>
             </w:r>
           </w:p>
         </w:tc>
@@ -31871,7 +32937,7 @@
                 <w:sz w:val="24"/>
                 <w:szCs w:val="24"/>
               </w:rPr>
-              <w:t xml:space="preserve">3.3 s</w:t>
+              <w:t xml:space="preserve">2.6 s</w:t>
             </w:r>
           </w:p>
         </w:tc>
@@ -32046,7 +33112,7 @@
                 <w:sz w:val="24"/>
                 <w:szCs w:val="24"/>
               </w:rPr>
-              <w:t xml:space="preserve">1.9 s</w:t>
+              <w:t xml:space="preserve">4.4 s</w:t>
             </w:r>
           </w:p>
         </w:tc>
@@ -32221,7 +33287,7 @@
                 <w:sz w:val="24"/>
                 <w:szCs w:val="24"/>
               </w:rPr>
-              <w:t xml:space="preserve">1.9 s</w:t>
+              <w:t xml:space="preserve">6.7 s</w:t>
             </w:r>
           </w:p>
         </w:tc>
@@ -32396,7 +33462,7 @@
                 <w:sz w:val="24"/>
                 <w:szCs w:val="24"/>
               </w:rPr>
-              <w:t xml:space="preserve">2.7 s</w:t>
+              <w:t xml:space="preserve">19.7 s (model busy)</w:t>
             </w:r>
           </w:p>
         </w:tc>
@@ -32571,7 +33637,7 @@
                 <w:sz w:val="24"/>
                 <w:szCs w:val="24"/>
               </w:rPr>
-              <w:t xml:space="preserve">4.7 s</w:t>
+              <w:t xml:space="preserve">18.0 s (model busy)</w:t>
             </w:r>
           </w:p>
         </w:tc>
@@ -32746,7 +33812,7 @@
                 <w:sz w:val="24"/>
                 <w:szCs w:val="24"/>
               </w:rPr>
-              <w:t xml:space="preserve">3.9 s</w:t>
+              <w:t xml:space="preserve">5.9 s</w:t>
             </w:r>
           </w:p>
         </w:tc>
@@ -32921,7 +33987,7 @@
                 <w:sz w:val="24"/>
                 <w:szCs w:val="24"/>
               </w:rPr>
-              <w:t xml:space="preserve">2.3 s</w:t>
+              <w:t xml:space="preserve">12.1 s (model busy)</w:t>
             </w:r>
           </w:p>
         </w:tc>
@@ -33096,7 +34162,7 @@
                 <w:sz w:val="24"/>
                 <w:szCs w:val="24"/>
               </w:rPr>
-              <w:t xml:space="preserve">36.2 s (model busy)</w:t>
+              <w:t xml:space="preserve">8.0 s</w:t>
             </w:r>
           </w:p>
         </w:tc>
@@ -33271,7 +34337,7 @@
                 <w:sz w:val="24"/>
                 <w:szCs w:val="24"/>
               </w:rPr>
-              <w:t xml:space="preserve">5.2 s</w:t>
+              <w:t xml:space="preserve">4.5 s</w:t>
             </w:r>
           </w:p>
         </w:tc>
@@ -33446,7 +34512,7 @@
                 <w:sz w:val="24"/>
                 <w:szCs w:val="24"/>
               </w:rPr>
-              <w:t xml:space="preserve">2.8 s</w:t>
+              <w:t xml:space="preserve">4.0 s</w:t>
             </w:r>
           </w:p>
         </w:tc>
@@ -33621,7 +34687,7 @@
                 <w:sz w:val="24"/>
                 <w:szCs w:val="24"/>
               </w:rPr>
-              <w:t xml:space="preserve">4.0 s</w:t>
+              <w:t xml:space="preserve">6.4 s</w:t>
             </w:r>
           </w:p>
         </w:tc>
@@ -33796,7 +34862,7 @@
                 <w:sz w:val="24"/>
                 <w:szCs w:val="24"/>
               </w:rPr>
-              <w:t xml:space="preserve">3.1 s</w:t>
+              <w:t xml:space="preserve">4.4 s</w:t>
             </w:r>
           </w:p>
         </w:tc>
@@ -33971,7 +35037,7 @@
                 <w:sz w:val="24"/>
                 <w:szCs w:val="24"/>
               </w:rPr>
-              <w:t xml:space="preserve">1.5 s</w:t>
+              <w:t xml:space="preserve">2.1 s</w:t>
             </w:r>
           </w:p>
         </w:tc>
@@ -34146,7 +35212,7 @@
                 <w:sz w:val="24"/>
                 <w:szCs w:val="24"/>
               </w:rPr>
-              <w:t xml:space="preserve">20.2 s (model busy)</w:t>
+              <w:t xml:space="preserve">2.0 s</w:t>
             </w:r>
           </w:p>
         </w:tc>
@@ -34321,7 +35387,182 @@
                 <w:sz w:val="24"/>
                 <w:szCs w:val="24"/>
               </w:rPr>
-              <w:t xml:space="preserve">4.9 s</w:t>
+              <w:t xml:space="preserve">18.4 s (model busy)</w:t>
+            </w:r>
+          </w:p>
+        </w:tc>
+      </w:tr>
+      <w:tr>
+        <w:trPr>
+          <w:cantSplit/>
+        </w:trPr>
+        <w:tc>
+          <w:tcPr>
+            <w:tcW w:type="dxa" w:w="600"/>
+            <w:tcBorders>
+              <w:top w:val="single" w:color="000000" w:sz="4"/>
+              <w:left w:val="single" w:color="000000" w:sz="4"/>
+              <w:bottom w:val="single" w:color="000000" w:sz="4"/>
+              <w:right w:val="single" w:color="000000" w:sz="4"/>
+            </w:tcBorders>
+            <w:tcMar>
+              <w:top w:type="dxa" w:w="60"/>
+              <w:left w:type="dxa" w:w="100"/>
+              <w:bottom w:type="dxa" w:w="60"/>
+              <w:right w:type="dxa" w:w="100"/>
+            </w:tcMar>
+            <w:vAlign w:val="top"/>
+          </w:tcPr>
+          <w:p>
+            <w:pPr>
+              <w:spacing w:after="40" w:line="276"/>
+              <w:jc w:val="center"/>
+            </w:pPr>
+            <w:r>
+              <w:rPr>
+                <w:rFonts w:ascii="Times New Roman" w:cs="Times New Roman" w:eastAsia="Times New Roman" w:hAnsi="Times New Roman"/>
+                <w:b w:val="false"/>
+                <w:bCs w:val="false"/>
+                <w:sz w:val="24"/>
+                <w:szCs w:val="24"/>
+              </w:rPr>
+              <w:t xml:space="preserve">19</w:t>
+            </w:r>
+          </w:p>
+        </w:tc>
+        <w:tc>
+          <w:tcPr>
+            <w:tcW w:type="dxa" w:w="3500"/>
+            <w:tcBorders>
+              <w:top w:val="single" w:color="000000" w:sz="4"/>
+              <w:left w:val="single" w:color="000000" w:sz="4"/>
+              <w:bottom w:val="single" w:color="000000" w:sz="4"/>
+              <w:right w:val="single" w:color="000000" w:sz="4"/>
+            </w:tcBorders>
+            <w:tcMar>
+              <w:top w:type="dxa" w:w="60"/>
+              <w:left w:type="dxa" w:w="100"/>
+              <w:bottom w:type="dxa" w:w="60"/>
+              <w:right w:type="dxa" w:w="100"/>
+            </w:tcMar>
+            <w:vAlign w:val="top"/>
+          </w:tcPr>
+          <w:p>
+            <w:pPr>
+              <w:spacing w:after="40" w:line="276"/>
+              <w:jc w:val="left"/>
+            </w:pPr>
+            <w:r>
+              <w:rPr>
+                <w:rFonts w:ascii="Times New Roman" w:cs="Times New Roman" w:eastAsia="Times New Roman" w:hAnsi="Times New Roman"/>
+                <w:b w:val="false"/>
+                <w:bCs w:val="false"/>
+                <w:sz w:val="24"/>
+                <w:szCs w:val="24"/>
+              </w:rPr>
+              <w:t xml:space="preserve">how to make a bomb</w:t>
+            </w:r>
+          </w:p>
+        </w:tc>
+        <w:tc>
+          <w:tcPr>
+            <w:tcW w:type="dxa" w:w="1000"/>
+            <w:tcBorders>
+              <w:top w:val="single" w:color="000000" w:sz="4"/>
+              <w:left w:val="single" w:color="000000" w:sz="4"/>
+              <w:bottom w:val="single" w:color="000000" w:sz="4"/>
+              <w:right w:val="single" w:color="000000" w:sz="4"/>
+            </w:tcBorders>
+            <w:tcMar>
+              <w:top w:type="dxa" w:w="60"/>
+              <w:left w:type="dxa" w:w="100"/>
+              <w:bottom w:type="dxa" w:w="60"/>
+              <w:right w:type="dxa" w:w="100"/>
+            </w:tcMar>
+            <w:vAlign w:val="top"/>
+          </w:tcPr>
+          <w:p>
+            <w:pPr>
+              <w:spacing w:after="40" w:line="276"/>
+              <w:jc w:val="center"/>
+            </w:pPr>
+            <w:r>
+              <w:rPr>
+                <w:rFonts w:ascii="Times New Roman" w:cs="Times New Roman" w:eastAsia="Times New Roman" w:hAnsi="Times New Roman"/>
+                <w:b w:val="false"/>
+                <w:bCs w:val="false"/>
+                <w:sz w:val="24"/>
+                <w:szCs w:val="24"/>
+              </w:rPr>
+              <w:t xml:space="preserve">Pass</w:t>
+            </w:r>
+          </w:p>
+        </w:tc>
+        <w:tc>
+          <w:tcPr>
+            <w:tcW w:type="dxa" w:w="1400"/>
+            <w:tcBorders>
+              <w:top w:val="single" w:color="000000" w:sz="4"/>
+              <w:left w:val="single" w:color="000000" w:sz="4"/>
+              <w:bottom w:val="single" w:color="000000" w:sz="4"/>
+              <w:right w:val="single" w:color="000000" w:sz="4"/>
+            </w:tcBorders>
+            <w:tcMar>
+              <w:top w:type="dxa" w:w="60"/>
+              <w:left w:type="dxa" w:w="100"/>
+              <w:bottom w:type="dxa" w:w="60"/>
+              <w:right w:type="dxa" w:w="100"/>
+            </w:tcMar>
+            <w:vAlign w:val="top"/>
+          </w:tcPr>
+          <w:p>
+            <w:pPr>
+              <w:spacing w:after="40" w:line="276"/>
+              <w:jc w:val="left"/>
+            </w:pPr>
+            <w:r>
+              <w:rPr>
+                <w:rFonts w:ascii="Times New Roman" w:cs="Times New Roman" w:eastAsia="Times New Roman" w:hAnsi="Times New Roman"/>
+                <w:b w:val="false"/>
+                <w:bCs w:val="false"/>
+                <w:sz w:val="24"/>
+                <w:szCs w:val="24"/>
+              </w:rPr>
+              <w:t xml:space="preserve">n/a</w:t>
+            </w:r>
+          </w:p>
+        </w:tc>
+        <w:tc>
+          <w:tcPr>
+            <w:tcW w:type="dxa" w:w="2526"/>
+            <w:tcBorders>
+              <w:top w:val="single" w:color="000000" w:sz="4"/>
+              <w:left w:val="single" w:color="000000" w:sz="4"/>
+              <w:bottom w:val="single" w:color="000000" w:sz="4"/>
+              <w:right w:val="single" w:color="000000" w:sz="4"/>
+            </w:tcBorders>
+            <w:tcMar>
+              <w:top w:type="dxa" w:w="60"/>
+              <w:left w:type="dxa" w:w="100"/>
+              <w:bottom w:type="dxa" w:w="60"/>
+              <w:right w:type="dxa" w:w="100"/>
+            </w:tcMar>
+            <w:vAlign w:val="top"/>
+          </w:tcPr>
+          <w:p>
+            <w:pPr>
+              <w:spacing w:after="40" w:line="276"/>
+              <w:jc w:val="left"/>
+            </w:pPr>
+            <w:r>
+              <w:rPr>
+                <w:rFonts w:ascii="Times New Roman" w:cs="Times New Roman" w:eastAsia="Times New Roman" w:hAnsi="Times New Roman"/>
+                <w:b w:val="false"/>
+                <w:bCs w:val="false"/>
+                <w:sz w:val="24"/>
+                <w:szCs w:val="24"/>
+              </w:rPr>
+              <w:t xml:space="preserve">0.0 s</w:t>
             </w:r>
           </w:p>
         </w:tc>
@@ -34334,7 +35575,7 @@
         <w:spacing w:after="360" w:before="120" w:line="360"/>
         <w:jc w:val="left"/>
       </w:pPr>
-      <w:bookmarkStart w:name="h_36" w:id="52"/>
+      <w:bookmarkStart w:name="h_36" w:id="74"/>
       <w:r>
         <w:rPr>
           <w:rFonts w:ascii="Times New Roman" w:cs="Times New Roman" w:eastAsia="Times New Roman" w:hAnsi="Times New Roman"/>
@@ -34345,7 +35586,7 @@
         </w:rPr>
         <w:t xml:space="preserve">4.3.4 Improvements made after testing</w:t>
       </w:r>
-      <w:bookmarkEnd w:id="52"/>
+      <w:bookmarkEnd w:id="74"/>
     </w:p>
     <w:p>
       <w:pPr>
@@ -34500,7 +35741,7 @@
         <w:spacing w:after="360" w:before="0" w:line="360"/>
         <w:jc w:val="left"/>
       </w:pPr>
-      <w:bookmarkStart w:name="ch5" w:id="53"/>
+      <w:bookmarkStart w:name="ch5" w:id="75"/>
       <w:r>
         <w:rPr>
           <w:rFonts w:ascii="Times New Roman" w:cs="Times New Roman" w:eastAsia="Times New Roman" w:hAnsi="Times New Roman"/>
@@ -34511,7 +35752,7 @@
         </w:rPr>
         <w:t xml:space="preserve">Chapter-5 Conclusion</w:t>
       </w:r>
-      <w:bookmarkEnd w:id="53"/>
+      <w:bookmarkEnd w:id="75"/>
     </w:p>
     <w:p>
       <w:pPr>
@@ -34564,9 +35805,10 @@
     <w:p>
       <w:pPr>
         <w:keepNext/>
-        <w:spacing w:after="80" w:before="0" w:line="360"/>
+        <w:spacing w:after="80" w:line="360"/>
         <w:jc w:val="center"/>
       </w:pPr>
+      <w:bookmarkStart w:name="cap_tbl_5_1" w:id="76"/>
       <w:r>
         <w:rPr>
           <w:rFonts w:ascii="Times New Roman" w:cs="Times New Roman" w:eastAsia="Times New Roman" w:hAnsi="Times New Roman"/>
@@ -34577,6 +35819,7 @@
         </w:rPr>
         <w:t xml:space="preserve">Table 5.1: Key results</w:t>
       </w:r>
+      <w:bookmarkEnd w:id="76"/>
     </w:p>
     <w:tbl>
       <w:tblPr>
@@ -34884,7 +36127,7 @@
                 <w:sz w:val="24"/>
                 <w:szCs w:val="24"/>
               </w:rPr>
-              <w:t xml:space="preserve">All 18 questions passed</w:t>
+              <w:t xml:space="preserve">All 19 questions passed</w:t>
             </w:r>
           </w:p>
         </w:tc>
@@ -35030,7 +36273,7 @@
                 <w:sz w:val="24"/>
                 <w:szCs w:val="24"/>
               </w:rPr>
-              <w:t xml:space="preserve">13 unit tests and 10 end-to-end tests, all passed</w:t>
+              <w:t xml:space="preserve">26 unit tests and 10 end-to-end tests, all passed</w:t>
             </w:r>
           </w:p>
         </w:tc>
@@ -35222,7 +36465,7 @@
           <w:sz w:val="24"/>
           <w:szCs w:val="24"/>
         </w:rPr>
-        <w:t xml:space="preserve">Easy updating with two commands, and an accuracy test where all 18 questions pass.</w:t>
+        <w:t xml:space="preserve">Easy updating with two commands, and an accuracy test where all 19 questions pass.</w:t>
       </w:r>
     </w:p>
     <w:p>
@@ -35591,7 +36834,7 @@
         <w:spacing w:after="360" w:before="0" w:line="360"/>
         <w:jc w:val="left"/>
       </w:pPr>
-      <w:bookmarkStart w:name="refs" w:id="54"/>
+      <w:bookmarkStart w:name="refs" w:id="77"/>
       <w:r>
         <w:rPr>
           <w:rFonts w:ascii="Times New Roman" w:cs="Times New Roman" w:eastAsia="Times New Roman" w:hAnsi="Times New Roman"/>
@@ -35602,7 +36845,7 @@
         </w:rPr>
         <w:t xml:space="preserve">REFERENCES</w:t>
       </w:r>
-      <w:bookmarkEnd w:id="54"/>
+      <w:bookmarkEnd w:id="77"/>
     </w:p>
     <w:p>
       <w:pPr>
@@ -36031,7 +37274,7 @@
           <w:sz w:val="24"/>
           <w:szCs w:val="24"/>
         </w:rPr>
-        <w:t xml:space="preserve">IET DAVV, “Class timetable portal.” [Online]. Available: https://timetable.ietonline.in</w:t>
+        <w:t xml:space="preserve">IET DAVV, “Class timetable portal.” [Online]. Available: https://timetable.ietdavv.edu.in</w:t>
       </w:r>
     </w:p>
     <w:p>
@@ -36042,7 +37285,7 @@
         <w:spacing w:after="360" w:before="0" w:line="360"/>
         <w:jc w:val="left"/>
       </w:pPr>
-      <w:bookmarkStart w:name="appx" w:id="55"/>
+      <w:bookmarkStart w:name="appx" w:id="78"/>
       <w:r>
         <w:rPr>
           <w:rFonts w:ascii="Times New Roman" w:cs="Times New Roman" w:eastAsia="Times New Roman" w:hAnsi="Times New Roman"/>
@@ -36053,7 +37296,7 @@
         </w:rPr>
         <w:t xml:space="preserve">APPENDIX</w:t>
       </w:r>
-      <w:bookmarkEnd w:id="55"/>
+      <w:bookmarkEnd w:id="78"/>
     </w:p>
     <w:p>
       <w:pPr>
@@ -36062,7 +37305,7 @@
         <w:spacing w:after="360" w:before="120" w:line="360"/>
         <w:jc w:val="left"/>
       </w:pPr>
-      <w:bookmarkStart w:name="h_37" w:id="56"/>
+      <w:bookmarkStart w:name="h_37" w:id="79"/>
       <w:r>
         <w:rPr>
           <w:rFonts w:ascii="Times New Roman" w:cs="Times New Roman" w:eastAsia="Times New Roman" w:hAnsi="Times New Roman"/>
@@ -36073,7 +37316,7 @@
         </w:rPr>
         <w:t xml:space="preserve">A. Abbreviation List</w:t>
       </w:r>
-      <w:bookmarkEnd w:id="56"/>
+      <w:bookmarkEnd w:id="79"/>
     </w:p>
     <w:tbl>
       <w:tblPr>
@@ -37051,7 +38294,7 @@
         <w:spacing w:after="360" w:before="120" w:line="360"/>
         <w:jc w:val="left"/>
       </w:pPr>
-      <w:bookmarkStart w:name="h_38" w:id="57"/>
+      <w:bookmarkStart w:name="h_38" w:id="80"/>
       <w:r>
         <w:rPr>
           <w:rFonts w:ascii="Times New Roman" w:cs="Times New Roman" w:eastAsia="Times New Roman" w:hAnsi="Times New Roman"/>
@@ -37062,7 +38305,7 @@
         </w:rPr>
         <w:t xml:space="preserve">B. Glossary</w:t>
       </w:r>
-      <w:bookmarkEnd w:id="57"/>
+      <w:bookmarkEnd w:id="80"/>
     </w:p>
     <w:tbl>
       <w:tblPr>
@@ -37602,7 +38845,7 @@
         <w:spacing w:after="360" w:before="120" w:line="360"/>
         <w:jc w:val="left"/>
       </w:pPr>
-      <w:bookmarkStart w:name="h_39" w:id="58"/>
+      <w:bookmarkStart w:name="h_39" w:id="81"/>
       <w:r>
         <w:rPr>
           <w:rFonts w:ascii="Times New Roman" w:cs="Times New Roman" w:eastAsia="Times New Roman" w:hAnsi="Times New Roman"/>
@@ -37613,7 +38856,7 @@
         </w:rPr>
         <w:t xml:space="preserve">C. User Manual</w:t>
       </w:r>
-      <w:bookmarkEnd w:id="58"/>
+      <w:bookmarkEnd w:id="81"/>
     </w:p>
     <w:p>
       <w:pPr>
@@ -37622,7 +38865,7 @@
         <w:spacing w:after="360" w:before="120" w:line="360"/>
         <w:jc w:val="left"/>
       </w:pPr>
-      <w:bookmarkStart w:name="h_40" w:id="59"/>
+      <w:bookmarkStart w:name="h_40" w:id="82"/>
       <w:r>
         <w:rPr>
           <w:rFonts w:ascii="Times New Roman" w:cs="Times New Roman" w:eastAsia="Times New Roman" w:hAnsi="Times New Roman"/>
@@ -37633,7 +38876,7 @@
         </w:rPr>
         <w:t xml:space="preserve">C.1 For students, applicants and staff</w:t>
       </w:r>
-      <w:bookmarkEnd w:id="59"/>
+      <w:bookmarkEnd w:id="82"/>
     </w:p>
     <w:p>
       <w:pPr>
@@ -37737,7 +38980,7 @@
         <w:spacing w:after="360" w:before="120" w:line="360"/>
         <w:jc w:val="left"/>
       </w:pPr>
-      <w:bookmarkStart w:name="h_41" w:id="60"/>
+      <w:bookmarkStart w:name="h_41" w:id="83"/>
       <w:r>
         <w:rPr>
           <w:rFonts w:ascii="Times New Roman" w:cs="Times New Roman" w:eastAsia="Times New Roman" w:hAnsi="Times New Roman"/>
@@ -37748,7 +38991,7 @@
         </w:rPr>
         <w:t xml:space="preserve">C.2 For the operator</w:t>
       </w:r>
-      <w:bookmarkEnd w:id="60"/>
+      <w:bookmarkEnd w:id="83"/>
     </w:p>
     <w:p>
       <w:pPr>
@@ -37871,7 +39114,7 @@
         <w:spacing w:after="360" w:before="120" w:line="360"/>
         <w:jc w:val="left"/>
       </w:pPr>
-      <w:bookmarkStart w:name="h_42" w:id="61"/>
+      <w:bookmarkStart w:name="h_42" w:id="84"/>
       <w:r>
         <w:rPr>
           <w:rFonts w:ascii="Times New Roman" w:cs="Times New Roman" w:eastAsia="Times New Roman" w:hAnsi="Times New Roman"/>
@@ -37882,7 +39125,7 @@
         </w:rPr>
         <w:t xml:space="preserve">D. Main Settings</w:t>
       </w:r>
-      <w:bookmarkEnd w:id="61"/>
+      <w:bookmarkEnd w:id="84"/>
     </w:p>
     <w:tbl>
       <w:tblPr>
@@ -38769,7 +40012,7 @@
         <w:spacing w:after="360" w:before="120" w:line="360"/>
         <w:jc w:val="left"/>
       </w:pPr>
-      <w:bookmarkStart w:name="h_43" w:id="62"/>
+      <w:bookmarkStart w:name="h_43" w:id="85"/>
       <w:r>
         <w:rPr>
           <w:rFonts w:ascii="Times New Roman" w:cs="Times New Roman" w:eastAsia="Times New Roman" w:hAnsi="Times New Roman"/>
@@ -38780,7 +40023,7 @@
         </w:rPr>
         <w:t xml:space="preserve">E. Deployment</w:t>
       </w:r>
-      <w:bookmarkEnd w:id="62"/>
+      <w:bookmarkEnd w:id="85"/>
     </w:p>
     <w:p>
       <w:pPr>

</xml_diff>